<commit_message>
Band 1: Kapitelkoepfe auf Muster A umgestellt (wie Band 4)
Gleiche Aenderung wie Band 4, portiert auf Band 1s create_manuscript.py:
- Sink ueber echten Leerraum-Absatz, hier 44pt statt 56pt (5x8-Format ist
  kleiner -> proportional gleicher Einzug)
- Kapitelnummer als gesperrte graue Versalien "KAPITEL 12", Epilog "EPILOG"
- Titel 17pt, 22pt Luft nach unten
- Heading-Ebenen 1/2 erhalten (eBook-Navigation)

Manuskript.docx neu kompiliert (~29.261 Woerter).
HINWEIS: Band 1 ist veroeffentlicht -- Re-Upload aendert Seitenzahl und
loest KDP-Pruefung aus. Bewusste Entscheidung des Autors, wann.

Co-Authored-By: Claude Opus 4.8 <noreply@anthropic.com>
</commit_message>
<xml_diff>
--- a/Band_1/Linear/Manuskript.docx
+++ b/Band_1/Linear/Manuskript.docx
@@ -650,7 +650,7 @@
     </w:p>
     <w:p>
       <w:pPr>
-        <w:spacing w:after="200"/>
+        <w:spacing w:before="0" w:after="880"/>
       </w:pPr>
     </w:p>
     <w:p>
@@ -658,18 +658,21 @@
         <w:pStyle w:val="Heading2"/>
       </w:pPr>
       <w:r>
-        <w:t>Kapitel 1</w:t>
-      </w:r>
-    </w:p>
-    <w:p>
-      <w:bookmarkStart w:id="46961" w:name="kapitel_1"/>
+        <w:rPr>
+          <w:spacing w:val="52"/>
+        </w:rPr>
+        <w:t>KAPITEL 1</w:t>
+      </w:r>
+    </w:p>
+    <w:p>
+      <w:bookmarkStart w:id="65118" w:name="kapitel_1"/>
       <w:pPr>
         <w:pStyle w:val="Heading1"/>
       </w:pPr>
       <w:r>
         <w:t>Der Blick zum Hügel</w:t>
       </w:r>
-      <w:bookmarkEnd w:id="46961"/>
+      <w:bookmarkEnd w:id="65118"/>
     </w:p>
     <w:p>
       <w:pPr>
@@ -2370,7 +2373,7 @@
     </w:p>
     <w:p>
       <w:pPr>
-        <w:spacing w:after="200"/>
+        <w:spacing w:before="0" w:after="880"/>
       </w:pPr>
     </w:p>
     <w:p>
@@ -2378,18 +2381,21 @@
         <w:pStyle w:val="Heading2"/>
       </w:pPr>
       <w:r>
-        <w:t>Kapitel 2</w:t>
-      </w:r>
-    </w:p>
-    <w:p>
-      <w:bookmarkStart w:id="24962" w:name="kapitel_2"/>
+        <w:rPr>
+          <w:spacing w:val="52"/>
+        </w:rPr>
+        <w:t>KAPITEL 2</w:t>
+      </w:r>
+    </w:p>
+    <w:p>
+      <w:bookmarkStart w:id="20860" w:name="kapitel_2"/>
       <w:pPr>
         <w:pStyle w:val="Heading1"/>
       </w:pPr>
       <w:r>
         <w:t>Das alte Gerücht</w:t>
       </w:r>
-      <w:bookmarkEnd w:id="24962"/>
+      <w:bookmarkEnd w:id="20860"/>
     </w:p>
     <w:p>
       <w:pPr>
@@ -4469,7 +4475,7 @@
     </w:p>
     <w:p>
       <w:pPr>
-        <w:spacing w:after="200"/>
+        <w:spacing w:before="0" w:after="880"/>
       </w:pPr>
     </w:p>
     <w:p>
@@ -4477,18 +4483,21 @@
         <w:pStyle w:val="Heading2"/>
       </w:pPr>
       <w:r>
-        <w:t>Kapitel 3</w:t>
-      </w:r>
-    </w:p>
-    <w:p>
-      <w:bookmarkStart w:id="97541" w:name="kapitel_3"/>
+        <w:rPr>
+          <w:spacing w:val="52"/>
+        </w:rPr>
+        <w:t>KAPITEL 3</w:t>
+      </w:r>
+    </w:p>
+    <w:p>
+      <w:bookmarkStart w:id="99684" w:name="kapitel_3"/>
       <w:pPr>
         <w:pStyle w:val="Heading1"/>
       </w:pPr>
       <w:r>
         <w:t>Der erste Beweis</w:t>
       </w:r>
-      <w:bookmarkEnd w:id="97541"/>
+      <w:bookmarkEnd w:id="99684"/>
     </w:p>
     <w:p>
       <w:pPr>
@@ -6310,7 +6319,7 @@
     </w:p>
     <w:p>
       <w:pPr>
-        <w:spacing w:after="200"/>
+        <w:spacing w:before="0" w:after="880"/>
       </w:pPr>
     </w:p>
     <w:p>
@@ -6318,18 +6327,21 @@
         <w:pStyle w:val="Heading2"/>
       </w:pPr>
       <w:r>
-        <w:t>Kapitel 4</w:t>
-      </w:r>
-    </w:p>
-    <w:p>
-      <w:bookmarkStart w:id="66873" w:name="kapitel_4"/>
+        <w:rPr>
+          <w:spacing w:val="52"/>
+        </w:rPr>
+        <w:t>KAPITEL 4</w:t>
+      </w:r>
+    </w:p>
+    <w:p>
+      <w:bookmarkStart w:id="35731" w:name="kapitel_4"/>
       <w:pPr>
         <w:pStyle w:val="Heading1"/>
       </w:pPr>
       <w:r>
         <w:t>Das verbotene Tor</w:t>
       </w:r>
-      <w:bookmarkEnd w:id="66873"/>
+      <w:bookmarkEnd w:id="35731"/>
     </w:p>
     <w:p>
       <w:pPr>
@@ -8187,7 +8199,7 @@
     </w:p>
     <w:p>
       <w:pPr>
-        <w:spacing w:after="200"/>
+        <w:spacing w:before="0" w:after="880"/>
       </w:pPr>
     </w:p>
     <w:p>
@@ -8195,18 +8207,21 @@
         <w:pStyle w:val="Heading2"/>
       </w:pPr>
       <w:r>
-        <w:t>Kapitel 5</w:t>
-      </w:r>
-    </w:p>
-    <w:p>
-      <w:bookmarkStart w:id="69037" w:name="kapitel_5"/>
+        <w:rPr>
+          <w:spacing w:val="52"/>
+        </w:rPr>
+        <w:t>KAPITEL 5</w:t>
+      </w:r>
+    </w:p>
+    <w:p>
+      <w:bookmarkStart w:id="12135" w:name="kapitel_5"/>
       <w:pPr>
         <w:pStyle w:val="Heading1"/>
       </w:pPr>
       <w:r>
         <w:t>Die geheime Botschaft</w:t>
       </w:r>
-      <w:bookmarkEnd w:id="69037"/>
+      <w:bookmarkEnd w:id="12135"/>
     </w:p>
     <w:p>
       <w:pPr>
@@ -9821,7 +9836,7 @@
     </w:p>
     <w:p>
       <w:pPr>
-        <w:spacing w:after="200"/>
+        <w:spacing w:before="0" w:after="880"/>
       </w:pPr>
     </w:p>
     <w:p>
@@ -9829,18 +9844,21 @@
         <w:pStyle w:val="Heading2"/>
       </w:pPr>
       <w:r>
-        <w:t>Kapitel 6</w:t>
-      </w:r>
-    </w:p>
-    <w:p>
-      <w:bookmarkStart w:id="72672" w:name="kapitel_6"/>
+        <w:rPr>
+          <w:spacing w:val="52"/>
+        </w:rPr>
+        <w:t>KAPITEL 6</w:t>
+      </w:r>
+    </w:p>
+    <w:p>
+      <w:bookmarkStart w:id="40141" w:name="kapitel_6"/>
       <w:pPr>
         <w:pStyle w:val="Heading1"/>
       </w:pPr>
       <w:r>
         <w:t>Das knarrende Treppenhaus</w:t>
       </w:r>
-      <w:bookmarkEnd w:id="72672"/>
+      <w:bookmarkEnd w:id="40141"/>
     </w:p>
     <w:p>
       <w:pPr>
@@ -11782,7 +11800,7 @@
     </w:p>
     <w:p>
       <w:pPr>
-        <w:spacing w:after="200"/>
+        <w:spacing w:before="0" w:after="880"/>
       </w:pPr>
     </w:p>
     <w:p>
@@ -11790,18 +11808,21 @@
         <w:pStyle w:val="Heading2"/>
       </w:pPr>
       <w:r>
-        <w:t>Kapitel 7</w:t>
-      </w:r>
-    </w:p>
-    <w:p>
-      <w:bookmarkStart w:id="11173" w:name="kapitel_7"/>
+        <w:rPr>
+          <w:spacing w:val="52"/>
+        </w:rPr>
+        <w:t>KAPITEL 7</w:t>
+      </w:r>
+    </w:p>
+    <w:p>
+      <w:bookmarkStart w:id="65569" w:name="kapitel_7"/>
       <w:pPr>
         <w:pStyle w:val="Heading1"/>
       </w:pPr>
       <w:r>
         <w:t>Die falsche Spur</w:t>
       </w:r>
-      <w:bookmarkEnd w:id="11173"/>
+      <w:bookmarkEnd w:id="65569"/>
     </w:p>
     <w:p>
       <w:pPr>
@@ -13877,7 +13898,7 @@
     </w:p>
     <w:p>
       <w:pPr>
-        <w:spacing w:after="200"/>
+        <w:spacing w:before="0" w:after="880"/>
       </w:pPr>
     </w:p>
     <w:p>
@@ -13885,18 +13906,21 @@
         <w:pStyle w:val="Heading2"/>
       </w:pPr>
       <w:r>
-        <w:t>Kapitel 8</w:t>
-      </w:r>
-    </w:p>
-    <w:p>
-      <w:bookmarkStart w:id="98814" w:name="kapitel_8"/>
+        <w:rPr>
+          <w:spacing w:val="52"/>
+        </w:rPr>
+        <w:t>KAPITEL 8</w:t>
+      </w:r>
+    </w:p>
+    <w:p>
+      <w:bookmarkStart w:id="2796" w:name="kapitel_8"/>
       <w:pPr>
         <w:pStyle w:val="Heading1"/>
       </w:pPr>
       <w:r>
         <w:t>Das Rätsel der Symbole</w:t>
       </w:r>
-      <w:bookmarkEnd w:id="98814"/>
+      <w:bookmarkEnd w:id="2796"/>
     </w:p>
     <w:p>
       <w:pPr>
@@ -15647,7 +15671,7 @@
     </w:p>
     <w:p>
       <w:pPr>
-        <w:spacing w:after="200"/>
+        <w:spacing w:before="0" w:after="880"/>
       </w:pPr>
     </w:p>
     <w:p>
@@ -15655,18 +15679,21 @@
         <w:pStyle w:val="Heading2"/>
       </w:pPr>
       <w:r>
-        <w:t>Kapitel 9</w:t>
-      </w:r>
-    </w:p>
-    <w:p>
-      <w:bookmarkStart w:id="7598" w:name="kapitel_9"/>
+        <w:rPr>
+          <w:spacing w:val="52"/>
+        </w:rPr>
+        <w:t>KAPITEL 9</w:t>
+      </w:r>
+    </w:p>
+    <w:p>
+      <w:bookmarkStart w:id="29400" w:name="kapitel_9"/>
       <w:pPr>
         <w:pStyle w:val="Heading1"/>
       </w:pPr>
       <w:r>
         <w:t>Die nächtliche Begegnung</w:t>
       </w:r>
-      <w:bookmarkEnd w:id="7598"/>
+      <w:bookmarkEnd w:id="29400"/>
     </w:p>
     <w:p>
       <w:pPr>
@@ -17938,7 +17965,7 @@
     </w:p>
     <w:p>
       <w:pPr>
-        <w:spacing w:after="200"/>
+        <w:spacing w:before="0" w:after="880"/>
       </w:pPr>
     </w:p>
     <w:p>
@@ -17946,18 +17973,21 @@
         <w:pStyle w:val="Heading2"/>
       </w:pPr>
       <w:r>
-        <w:t>Kapitel 10</w:t>
-      </w:r>
-    </w:p>
-    <w:p>
-      <w:bookmarkStart w:id="15985" w:name="kapitel_10"/>
+        <w:rPr>
+          <w:spacing w:val="52"/>
+        </w:rPr>
+        <w:t>KAPITEL 10</w:t>
+      </w:r>
+    </w:p>
+    <w:p>
+      <w:bookmarkStart w:id="59843" w:name="kapitel_10"/>
       <w:pPr>
         <w:pStyle w:val="Heading1"/>
       </w:pPr>
       <w:r>
         <w:t>Der Verdächtige</w:t>
       </w:r>
-      <w:bookmarkEnd w:id="15985"/>
+      <w:bookmarkEnd w:id="59843"/>
     </w:p>
     <w:p>
       <w:pPr>
@@ -19877,7 +19907,7 @@
     </w:p>
     <w:p>
       <w:pPr>
-        <w:spacing w:after="200"/>
+        <w:spacing w:before="0" w:after="880"/>
       </w:pPr>
     </w:p>
     <w:p>
@@ -19885,18 +19915,21 @@
         <w:pStyle w:val="Heading2"/>
       </w:pPr>
       <w:r>
-        <w:t>Kapitel 11</w:t>
-      </w:r>
-    </w:p>
-    <w:p>
-      <w:bookmarkStart w:id="66738" w:name="kapitel_11"/>
+        <w:rPr>
+          <w:spacing w:val="52"/>
+        </w:rPr>
+        <w:t>KAPITEL 11</w:t>
+      </w:r>
+    </w:p>
+    <w:p>
+      <w:bookmarkStart w:id="21859" w:name="kapitel_11"/>
       <w:pPr>
         <w:pStyle w:val="Heading1"/>
       </w:pPr>
       <w:r>
         <w:t>Die geheime Karte</w:t>
       </w:r>
-      <w:bookmarkEnd w:id="66738"/>
+      <w:bookmarkEnd w:id="21859"/>
     </w:p>
     <w:p>
       <w:pPr>
@@ -21959,7 +21992,7 @@
     </w:p>
     <w:p>
       <w:pPr>
-        <w:spacing w:after="200"/>
+        <w:spacing w:before="0" w:after="880"/>
       </w:pPr>
     </w:p>
     <w:p>
@@ -21967,18 +22000,21 @@
         <w:pStyle w:val="Heading2"/>
       </w:pPr>
       <w:r>
-        <w:t>Kapitel 12</w:t>
-      </w:r>
-    </w:p>
-    <w:p>
-      <w:bookmarkStart w:id="98441" w:name="kapitel_12"/>
+        <w:rPr>
+          <w:spacing w:val="52"/>
+        </w:rPr>
+        <w:t>KAPITEL 12</w:t>
+      </w:r>
+    </w:p>
+    <w:p>
+      <w:bookmarkStart w:id="71675" w:name="kapitel_12"/>
       <w:pPr>
         <w:pStyle w:val="Heading1"/>
       </w:pPr>
       <w:r>
         <w:t>Der verschlossene Keller</w:t>
       </w:r>
-      <w:bookmarkEnd w:id="98441"/>
+      <w:bookmarkEnd w:id="71675"/>
     </w:p>
     <w:p>
       <w:pPr>
@@ -24088,7 +24124,7 @@
     </w:p>
     <w:p>
       <w:pPr>
-        <w:spacing w:after="200"/>
+        <w:spacing w:before="0" w:after="880"/>
       </w:pPr>
     </w:p>
     <w:p>
@@ -24096,18 +24132,21 @@
         <w:pStyle w:val="Heading2"/>
       </w:pPr>
       <w:r>
-        <w:t>Kapitel 13</w:t>
-      </w:r>
-    </w:p>
-    <w:p>
-      <w:bookmarkStart w:id="8891" w:name="kapitel_13"/>
+        <w:rPr>
+          <w:spacing w:val="52"/>
+        </w:rPr>
+        <w:t>KAPITEL 13</w:t>
+      </w:r>
+    </w:p>
+    <w:p>
+      <w:bookmarkStart w:id="59065" w:name="kapitel_13"/>
       <w:pPr>
         <w:pStyle w:val="Heading1"/>
       </w:pPr>
       <w:r>
         <w:t>Eingeschlossen</w:t>
       </w:r>
-      <w:bookmarkEnd w:id="8891"/>
+      <w:bookmarkEnd w:id="59065"/>
     </w:p>
     <w:p>
       <w:pPr>
@@ -26076,7 +26115,7 @@
     </w:p>
     <w:p>
       <w:pPr>
-        <w:spacing w:after="200"/>
+        <w:spacing w:before="0" w:after="880"/>
       </w:pPr>
     </w:p>
     <w:p>
@@ -26084,18 +26123,21 @@
         <w:pStyle w:val="Heading2"/>
       </w:pPr>
       <w:r>
-        <w:t>Kapitel 14</w:t>
-      </w:r>
-    </w:p>
-    <w:p>
-      <w:bookmarkStart w:id="16026" w:name="kapitel_14"/>
+        <w:rPr>
+          <w:spacing w:val="52"/>
+        </w:rPr>
+        <w:t>KAPITEL 14</w:t>
+      </w:r>
+    </w:p>
+    <w:p>
+      <w:bookmarkStart w:id="93336" w:name="kapitel_14"/>
       <w:pPr>
         <w:pStyle w:val="Heading1"/>
       </w:pPr>
       <w:r>
         <w:t>Die Wahrheit über den Spuk</w:t>
       </w:r>
-      <w:bookmarkEnd w:id="16026"/>
+      <w:bookmarkEnd w:id="93336"/>
     </w:p>
     <w:p>
       <w:pPr>
@@ -28008,7 +28050,7 @@
     </w:p>
     <w:p>
       <w:pPr>
-        <w:spacing w:after="200"/>
+        <w:spacing w:before="0" w:after="880"/>
       </w:pPr>
     </w:p>
     <w:p>
@@ -28016,18 +28058,21 @@
         <w:pStyle w:val="Heading2"/>
       </w:pPr>
       <w:r>
-        <w:t>Kapitel 15</w:t>
-      </w:r>
-    </w:p>
-    <w:p>
-      <w:bookmarkStart w:id="18217" w:name="kapitel_15"/>
+        <w:rPr>
+          <w:spacing w:val="52"/>
+        </w:rPr>
+        <w:t>KAPITEL 15</w:t>
+      </w:r>
+    </w:p>
+    <w:p>
+      <w:bookmarkStart w:id="89967" w:name="kapitel_15"/>
       <w:pPr>
         <w:pStyle w:val="Heading1"/>
       </w:pPr>
       <w:r>
         <w:t>Belauscht</w:t>
       </w:r>
-      <w:bookmarkEnd w:id="18217"/>
+      <w:bookmarkEnd w:id="89967"/>
     </w:p>
     <w:p>
       <w:pPr>
@@ -29623,7 +29668,7 @@
     </w:p>
     <w:p>
       <w:pPr>
-        <w:spacing w:after="200"/>
+        <w:spacing w:before="0" w:after="880"/>
       </w:pPr>
     </w:p>
     <w:p>
@@ -29631,18 +29676,21 @@
         <w:pStyle w:val="Heading2"/>
       </w:pPr>
       <w:r>
-        <w:t>Kapitel 16</w:t>
-      </w:r>
-    </w:p>
-    <w:p>
-      <w:bookmarkStart w:id="28259" w:name="kapitel_16"/>
+        <w:rPr>
+          <w:spacing w:val="52"/>
+        </w:rPr>
+        <w:t>KAPITEL 16</w:t>
+      </w:r>
+    </w:p>
+    <w:p>
+      <w:bookmarkStart w:id="90883" w:name="kapitel_16"/>
       <w:pPr>
         <w:pStyle w:val="Heading1"/>
       </w:pPr>
       <w:r>
         <w:t>Die ganze Wahrheit</w:t>
       </w:r>
-      <w:bookmarkEnd w:id="28259"/>
+      <w:bookmarkEnd w:id="90883"/>
     </w:p>
     <w:p>
       <w:pPr>
@@ -31312,7 +31360,7 @@
     </w:p>
     <w:p>
       <w:pPr>
-        <w:spacing w:after="200"/>
+        <w:spacing w:before="0" w:after="880"/>
       </w:pPr>
     </w:p>
     <w:p>
@@ -31320,18 +31368,21 @@
         <w:pStyle w:val="Heading2"/>
       </w:pPr>
       <w:r>
-        <w:t>Kapitel 17</w:t>
-      </w:r>
-    </w:p>
-    <w:p>
-      <w:bookmarkStart w:id="13385" w:name="kapitel_17"/>
+        <w:rPr>
+          <w:spacing w:val="52"/>
+        </w:rPr>
+        <w:t>KAPITEL 17</w:t>
+      </w:r>
+    </w:p>
+    <w:p>
+      <w:bookmarkStart w:id="314" w:name="kapitel_17"/>
       <w:pPr>
         <w:pStyle w:val="Heading1"/>
       </w:pPr>
       <w:r>
         <w:t>Der letzte Wille</w:t>
       </w:r>
-      <w:bookmarkEnd w:id="13385"/>
+      <w:bookmarkEnd w:id="314"/>
     </w:p>
     <w:p>
       <w:pPr>
@@ -32901,7 +32952,7 @@
     </w:p>
     <w:p>
       <w:pPr>
-        <w:spacing w:after="200"/>
+        <w:spacing w:before="0" w:after="880"/>
       </w:pPr>
     </w:p>
     <w:p>
@@ -32909,18 +32960,21 @@
         <w:pStyle w:val="Heading2"/>
       </w:pPr>
       <w:r>
-        <w:t>Kapitel 18</w:t>
-      </w:r>
-    </w:p>
-    <w:p>
-      <w:bookmarkStart w:id="24965" w:name="kapitel_18"/>
+        <w:rPr>
+          <w:spacing w:val="52"/>
+        </w:rPr>
+        <w:t>KAPITEL 18</w:t>
+      </w:r>
+    </w:p>
+    <w:p>
+      <w:bookmarkStart w:id="9726" w:name="kapitel_18"/>
       <w:pPr>
         <w:pStyle w:val="Heading1"/>
       </w:pPr>
       <w:r>
         <w:t>Meiers Geschichte</w:t>
       </w:r>
-      <w:bookmarkEnd w:id="24965"/>
+      <w:bookmarkEnd w:id="9726"/>
     </w:p>
     <w:p>
       <w:pPr>
@@ -34774,7 +34828,7 @@
     </w:p>
     <w:p>
       <w:pPr>
-        <w:spacing w:after="200"/>
+        <w:spacing w:before="0" w:after="880"/>
       </w:pPr>
     </w:p>
     <w:p>
@@ -34782,18 +34836,21 @@
         <w:pStyle w:val="Heading2"/>
       </w:pPr>
       <w:r>
-        <w:t>Epilog</w:t>
-      </w:r>
-    </w:p>
-    <w:p>
-      <w:bookmarkStart w:id="64702" w:name="kapitel_19"/>
+        <w:rPr>
+          <w:spacing w:val="52"/>
+        </w:rPr>
+        <w:t>EPILOG</w:t>
+      </w:r>
+    </w:p>
+    <w:p>
+      <w:bookmarkStart w:id="23383" w:name="kapitel_19"/>
       <w:pPr>
         <w:pStyle w:val="Heading1"/>
       </w:pPr>
       <w:r>
         <w:t>Ein neues Geheimnis</w:t>
       </w:r>
-      <w:bookmarkEnd w:id="64702"/>
+      <w:bookmarkEnd w:id="23383"/>
     </w:p>
     <w:p>
       <w:pPr>
@@ -37126,7 +37183,7 @@
       <w:keepNext/>
       <w:keepLines/>
       <w:pageBreakBefore w:val="0"/>
-      <w:spacing w:before="0" w:after="200"/>
+      <w:spacing w:before="0" w:after="440"/>
       <w:jc w:val="center"/>
       <w:outlineLvl w:val="0"/>
     </w:pPr>
@@ -37135,7 +37192,7 @@
       <w:b/>
       <w:bCs/>
       <w:color w:val="000000"/>
-      <w:sz w:val="28"/>
+      <w:sz w:val="34"/>
       <w:szCs w:val="28"/>
     </w:rPr>
   </w:style>
@@ -37151,7 +37208,7 @@
     <w:pPr>
       <w:keepNext/>
       <w:keepLines/>
-      <w:spacing w:before="0" w:after="40"/>
+      <w:spacing w:before="0" w:after="280"/>
       <w:jc w:val="center"/>
       <w:outlineLvl w:val="1"/>
     </w:pPr>
@@ -37159,7 +37216,7 @@
       <w:rFonts w:asciiTheme="majorHAnsi" w:eastAsiaTheme="majorEastAsia" w:hAnsiTheme="majorHAnsi" w:cstheme="majorBidi" w:ascii="Georgia" w:hAnsi="Georgia"/>
       <w:b w:val="0"/>
       <w:bCs/>
-      <w:color w:val="646464"/>
+      <w:color w:val="5A5A5A"/>
       <w:sz w:val="22"/>
       <w:szCs w:val="26"/>
     </w:rPr>

</xml_diff>

<commit_message>
Band 1: Rezensions-QR-Code + echte Band-2-Leseprobe (wie Band 2)
- QR-Block auf der "Eine kleine Bitte"-Seite (ASIN B0GNZDSLSH), mit dem
  Zeilenabstand-Fix (line_spacing=1.0), sonst wuerde das Bild abgeschnitten.
- add_band2_teaser liest jetzt den ECHTEN Band-2-Kapitel-1-Text direkt aus der
  Datei (bis zum Cliffhanger "Mila beugte sich vor.", nach dem Siegelbruch)
  statt der alten, paraphrasierten ASCII-Fassung. Bleibt automatisch synchron.
  " -- " -> " — ". Kopf: LESEPROBE / Band 2 / Das Geheimnis des Brunnens /
  KAPITEL 1 / Der versiegelte Brief.
- Verifiziert: QR aus dem docx UND aus der via LibreOffice gerenderten
  Druckseite dekodiert -> korrekte Bewertungs-URL. Leseprobe + QR-Seite
  gerendert und gesichtet.

Co-Authored-By: Claude Opus 4.8 <noreply@anthropic.com>
</commit_message>
<xml_diff>
--- a/Band_1/Linear/Manuskript.docx
+++ b/Band_1/Linear/Manuskript.docx
@@ -665,14 +665,14 @@
       </w:r>
     </w:p>
     <w:p>
-      <w:bookmarkStart w:id="65118" w:name="kapitel_1"/>
+      <w:bookmarkStart w:id="75146" w:name="kapitel_1"/>
       <w:pPr>
         <w:pStyle w:val="Heading1"/>
       </w:pPr>
       <w:r>
         <w:t>Der Blick zum Hügel</w:t>
       </w:r>
-      <w:bookmarkEnd w:id="65118"/>
+      <w:bookmarkEnd w:id="75146"/>
     </w:p>
     <w:p>
       <w:pPr>
@@ -2388,14 +2388,14 @@
       </w:r>
     </w:p>
     <w:p>
-      <w:bookmarkStart w:id="20860" w:name="kapitel_2"/>
+      <w:bookmarkStart w:id="76386" w:name="kapitel_2"/>
       <w:pPr>
         <w:pStyle w:val="Heading1"/>
       </w:pPr>
       <w:r>
         <w:t>Das alte Gerücht</w:t>
       </w:r>
-      <w:bookmarkEnd w:id="20860"/>
+      <w:bookmarkEnd w:id="76386"/>
     </w:p>
     <w:p>
       <w:pPr>
@@ -4490,14 +4490,14 @@
       </w:r>
     </w:p>
     <w:p>
-      <w:bookmarkStart w:id="99684" w:name="kapitel_3"/>
+      <w:bookmarkStart w:id="75506" w:name="kapitel_3"/>
       <w:pPr>
         <w:pStyle w:val="Heading1"/>
       </w:pPr>
       <w:r>
         <w:t>Der erste Beweis</w:t>
       </w:r>
-      <w:bookmarkEnd w:id="99684"/>
+      <w:bookmarkEnd w:id="75506"/>
     </w:p>
     <w:p>
       <w:pPr>
@@ -6334,14 +6334,14 @@
       </w:r>
     </w:p>
     <w:p>
-      <w:bookmarkStart w:id="35731" w:name="kapitel_4"/>
+      <w:bookmarkStart w:id="70901" w:name="kapitel_4"/>
       <w:pPr>
         <w:pStyle w:val="Heading1"/>
       </w:pPr>
       <w:r>
         <w:t>Das verbotene Tor</w:t>
       </w:r>
-      <w:bookmarkEnd w:id="35731"/>
+      <w:bookmarkEnd w:id="70901"/>
     </w:p>
     <w:p>
       <w:pPr>
@@ -8214,14 +8214,14 @@
       </w:r>
     </w:p>
     <w:p>
-      <w:bookmarkStart w:id="12135" w:name="kapitel_5"/>
+      <w:bookmarkStart w:id="6134" w:name="kapitel_5"/>
       <w:pPr>
         <w:pStyle w:val="Heading1"/>
       </w:pPr>
       <w:r>
         <w:t>Die geheime Botschaft</w:t>
       </w:r>
-      <w:bookmarkEnd w:id="12135"/>
+      <w:bookmarkEnd w:id="6134"/>
     </w:p>
     <w:p>
       <w:pPr>
@@ -9851,14 +9851,14 @@
       </w:r>
     </w:p>
     <w:p>
-      <w:bookmarkStart w:id="40141" w:name="kapitel_6"/>
+      <w:bookmarkStart w:id="9909" w:name="kapitel_6"/>
       <w:pPr>
         <w:pStyle w:val="Heading1"/>
       </w:pPr>
       <w:r>
         <w:t>Das knarrende Treppenhaus</w:t>
       </w:r>
-      <w:bookmarkEnd w:id="40141"/>
+      <w:bookmarkEnd w:id="9909"/>
     </w:p>
     <w:p>
       <w:pPr>
@@ -11815,14 +11815,14 @@
       </w:r>
     </w:p>
     <w:p>
-      <w:bookmarkStart w:id="65569" w:name="kapitel_7"/>
+      <w:bookmarkStart w:id="97817" w:name="kapitel_7"/>
       <w:pPr>
         <w:pStyle w:val="Heading1"/>
       </w:pPr>
       <w:r>
         <w:t>Die falsche Spur</w:t>
       </w:r>
-      <w:bookmarkEnd w:id="65569"/>
+      <w:bookmarkEnd w:id="97817"/>
     </w:p>
     <w:p>
       <w:pPr>
@@ -13913,14 +13913,14 @@
       </w:r>
     </w:p>
     <w:p>
-      <w:bookmarkStart w:id="2796" w:name="kapitel_8"/>
+      <w:bookmarkStart w:id="71463" w:name="kapitel_8"/>
       <w:pPr>
         <w:pStyle w:val="Heading1"/>
       </w:pPr>
       <w:r>
         <w:t>Das Rätsel der Symbole</w:t>
       </w:r>
-      <w:bookmarkEnd w:id="2796"/>
+      <w:bookmarkEnd w:id="71463"/>
     </w:p>
     <w:p>
       <w:pPr>
@@ -15686,14 +15686,14 @@
       </w:r>
     </w:p>
     <w:p>
-      <w:bookmarkStart w:id="29400" w:name="kapitel_9"/>
+      <w:bookmarkStart w:id="76646" w:name="kapitel_9"/>
       <w:pPr>
         <w:pStyle w:val="Heading1"/>
       </w:pPr>
       <w:r>
         <w:t>Die nächtliche Begegnung</w:t>
       </w:r>
-      <w:bookmarkEnd w:id="29400"/>
+      <w:bookmarkEnd w:id="76646"/>
     </w:p>
     <w:p>
       <w:pPr>
@@ -17980,14 +17980,14 @@
       </w:r>
     </w:p>
     <w:p>
-      <w:bookmarkStart w:id="59843" w:name="kapitel_10"/>
+      <w:bookmarkStart w:id="86109" w:name="kapitel_10"/>
       <w:pPr>
         <w:pStyle w:val="Heading1"/>
       </w:pPr>
       <w:r>
         <w:t>Der Verdächtige</w:t>
       </w:r>
-      <w:bookmarkEnd w:id="59843"/>
+      <w:bookmarkEnd w:id="86109"/>
     </w:p>
     <w:p>
       <w:pPr>
@@ -19922,14 +19922,14 @@
       </w:r>
     </w:p>
     <w:p>
-      <w:bookmarkStart w:id="21859" w:name="kapitel_11"/>
+      <w:bookmarkStart w:id="44232" w:name="kapitel_11"/>
       <w:pPr>
         <w:pStyle w:val="Heading1"/>
       </w:pPr>
       <w:r>
         <w:t>Die geheime Karte</w:t>
       </w:r>
-      <w:bookmarkEnd w:id="21859"/>
+      <w:bookmarkEnd w:id="44232"/>
     </w:p>
     <w:p>
       <w:pPr>
@@ -22007,14 +22007,14 @@
       </w:r>
     </w:p>
     <w:p>
-      <w:bookmarkStart w:id="71675" w:name="kapitel_12"/>
+      <w:bookmarkStart w:id="65490" w:name="kapitel_12"/>
       <w:pPr>
         <w:pStyle w:val="Heading1"/>
       </w:pPr>
       <w:r>
         <w:t>Der verschlossene Keller</w:t>
       </w:r>
-      <w:bookmarkEnd w:id="71675"/>
+      <w:bookmarkEnd w:id="65490"/>
     </w:p>
     <w:p>
       <w:pPr>
@@ -24139,14 +24139,14 @@
       </w:r>
     </w:p>
     <w:p>
-      <w:bookmarkStart w:id="59065" w:name="kapitel_13"/>
+      <w:bookmarkStart w:id="56131" w:name="kapitel_13"/>
       <w:pPr>
         <w:pStyle w:val="Heading1"/>
       </w:pPr>
       <w:r>
         <w:t>Eingeschlossen</w:t>
       </w:r>
-      <w:bookmarkEnd w:id="59065"/>
+      <w:bookmarkEnd w:id="56131"/>
     </w:p>
     <w:p>
       <w:pPr>
@@ -26130,14 +26130,14 @@
       </w:r>
     </w:p>
     <w:p>
-      <w:bookmarkStart w:id="93336" w:name="kapitel_14"/>
+      <w:bookmarkStart w:id="78603" w:name="kapitel_14"/>
       <w:pPr>
         <w:pStyle w:val="Heading1"/>
       </w:pPr>
       <w:r>
         <w:t>Die Wahrheit über den Spuk</w:t>
       </w:r>
-      <w:bookmarkEnd w:id="93336"/>
+      <w:bookmarkEnd w:id="78603"/>
     </w:p>
     <w:p>
       <w:pPr>
@@ -28065,14 +28065,14 @@
       </w:r>
     </w:p>
     <w:p>
-      <w:bookmarkStart w:id="89967" w:name="kapitel_15"/>
+      <w:bookmarkStart w:id="76023" w:name="kapitel_15"/>
       <w:pPr>
         <w:pStyle w:val="Heading1"/>
       </w:pPr>
       <w:r>
         <w:t>Belauscht</w:t>
       </w:r>
-      <w:bookmarkEnd w:id="89967"/>
+      <w:bookmarkEnd w:id="76023"/>
     </w:p>
     <w:p>
       <w:pPr>
@@ -29683,14 +29683,14 @@
       </w:r>
     </w:p>
     <w:p>
-      <w:bookmarkStart w:id="90883" w:name="kapitel_16"/>
+      <w:bookmarkStart w:id="1414" w:name="kapitel_16"/>
       <w:pPr>
         <w:pStyle w:val="Heading1"/>
       </w:pPr>
       <w:r>
         <w:t>Die ganze Wahrheit</w:t>
       </w:r>
-      <w:bookmarkEnd w:id="90883"/>
+      <w:bookmarkEnd w:id="1414"/>
     </w:p>
     <w:p>
       <w:pPr>
@@ -31375,14 +31375,14 @@
       </w:r>
     </w:p>
     <w:p>
-      <w:bookmarkStart w:id="314" w:name="kapitel_17"/>
+      <w:bookmarkStart w:id="9383" w:name="kapitel_17"/>
       <w:pPr>
         <w:pStyle w:val="Heading1"/>
       </w:pPr>
       <w:r>
         <w:t>Der letzte Wille</w:t>
       </w:r>
-      <w:bookmarkEnd w:id="314"/>
+      <w:bookmarkEnd w:id="9383"/>
     </w:p>
     <w:p>
       <w:pPr>
@@ -32967,14 +32967,14 @@
       </w:r>
     </w:p>
     <w:p>
-      <w:bookmarkStart w:id="9726" w:name="kapitel_18"/>
+      <w:bookmarkStart w:id="92433" w:name="kapitel_18"/>
       <w:pPr>
         <w:pStyle w:val="Heading1"/>
       </w:pPr>
       <w:r>
         <w:t>Meiers Geschichte</w:t>
       </w:r>
-      <w:bookmarkEnd w:id="9726"/>
+      <w:bookmarkEnd w:id="92433"/>
     </w:p>
     <w:p>
       <w:pPr>
@@ -34843,14 +34843,14 @@
       </w:r>
     </w:p>
     <w:p>
-      <w:bookmarkStart w:id="23383" w:name="kapitel_19"/>
+      <w:bookmarkStart w:id="62916" w:name="kapitel_19"/>
       <w:pPr>
         <w:pStyle w:val="Heading1"/>
       </w:pPr>
       <w:r>
         <w:t>Ein neues Geheimnis</w:t>
       </w:r>
-      <w:bookmarkEnd w:id="23383"/>
+      <w:bookmarkEnd w:id="62916"/>
     </w:p>
     <w:p>
       <w:pPr>
@@ -36069,12 +36069,81 @@
     <w:p/>
     <w:p>
       <w:pPr>
+        <w:spacing w:after="160"/>
+        <w:jc w:val="center"/>
+      </w:pPr>
+      <w:r>
+        <w:rPr>
+          <w:rFonts w:ascii="Georgia" w:hAnsi="Georgia"/>
+          <w:i/>
+          <w:sz w:val="22"/>
+        </w:rPr>
+        <w:t>Einfach den Code scannen und eine Bewertung dalassen:</w:t>
+      </w:r>
+    </w:p>
+    <w:p>
+      <w:pPr>
+        <w:spacing w:line="240" w:lineRule="auto" w:before="120" w:after="120"/>
+        <w:jc w:val="center"/>
+      </w:pPr>
+      <w:r>
+        <w:drawing>
+          <wp:inline xmlns:a="http://schemas.openxmlformats.org/drawingml/2006/main" xmlns:pic="http://schemas.openxmlformats.org/drawingml/2006/picture">
+            <wp:extent cx="1371600" cy="1371600"/>
+            <wp:docPr id="1" name="Picture 1"/>
+            <wp:cNvGraphicFramePr>
+              <a:graphicFrameLocks noChangeAspect="1"/>
+            </wp:cNvGraphicFramePr>
+            <a:graphic>
+              <a:graphicData uri="http://schemas.openxmlformats.org/drawingml/2006/picture">
+                <pic:pic>
+                  <pic:nvPicPr>
+                    <pic:cNvPr id="0" name="qr_rezension_band1.png"/>
+                    <pic:cNvPicPr/>
+                  </pic:nvPicPr>
+                  <pic:blipFill>
+                    <a:blip r:embed="rId9"/>
+                    <a:stretch>
+                      <a:fillRect/>
+                    </a:stretch>
+                  </pic:blipFill>
+                  <pic:spPr>
+                    <a:xfrm>
+                      <a:off x="0" y="0"/>
+                      <a:ext cx="1371600" cy="1371600"/>
+                    </a:xfrm>
+                    <a:prstGeom prst="rect"/>
+                  </pic:spPr>
+                </pic:pic>
+              </a:graphicData>
+            </a:graphic>
+          </wp:inline>
+        </w:drawing>
+      </w:r>
+    </w:p>
+    <w:p>
+      <w:pPr>
         <w:spacing w:after="200"/>
         <w:jc w:val="center"/>
       </w:pPr>
       <w:r>
         <w:rPr>
           <w:rFonts w:ascii="Georgia" w:hAnsi="Georgia"/>
+          <w:i/>
+          <w:sz w:val="18"/>
+        </w:rPr>
+        <w:t>(Handykamera auf den Code halten – der Link öffnet sich von selbst.)</w:t>
+      </w:r>
+    </w:p>
+    <w:p/>
+    <w:p>
+      <w:pPr>
+        <w:spacing w:after="200"/>
+        <w:jc w:val="center"/>
+      </w:pPr>
+      <w:r>
+        <w:rPr>
+          <w:rFonts w:ascii="Georgia" w:hAnsi="Georgia"/>
           <w:b/>
           <w:sz w:val="24"/>
         </w:rPr>
@@ -36110,22 +36179,36 @@
           <w:rFonts w:ascii="Georgia" w:hAnsi="Georgia"/>
           <w:color w:val="646464"/>
           <w:sz w:val="22"/>
-        </w:rPr>
-        <w:t>Leseprobe</w:t>
-      </w:r>
-    </w:p>
-    <w:p>
-      <w:pPr>
-        <w:spacing w:after="80"/>
+          <w:spacing w:val="52"/>
+        </w:rPr>
+        <w:t>LESEPROBE</w:t>
+      </w:r>
+    </w:p>
+    <w:p>
+      <w:pPr>
+        <w:spacing w:after="40"/>
         <w:jc w:val="center"/>
       </w:pPr>
       <w:r>
         <w:rPr>
           <w:rFonts w:ascii="Georgia" w:hAnsi="Georgia"/>
+          <w:sz w:val="26"/>
+        </w:rPr>
+        <w:t>Die Herrenhaus-Detektive, Band 2</w:t>
+      </w:r>
+    </w:p>
+    <w:p>
+      <w:pPr>
+        <w:spacing w:after="360"/>
+        <w:jc w:val="center"/>
+      </w:pPr>
+      <w:r>
+        <w:rPr>
+          <w:rFonts w:ascii="Georgia" w:hAnsi="Georgia"/>
           <w:b/>
-          <w:sz w:val="28"/>
-        </w:rPr>
-        <w:t>Die Herrenhaus-Detektive, Band 2</w:t>
+          <w:sz w:val="36"/>
+        </w:rPr>
+        <w:t>Das Geheimnis des Brunnens</w:t>
       </w:r>
     </w:p>
     <w:p>
@@ -36136,345 +36219,680 @@
       <w:r>
         <w:rPr>
           <w:rFonts w:ascii="Georgia" w:hAnsi="Georgia"/>
+          <w:color w:val="5A5A5A"/>
+          <w:sz w:val="22"/>
+          <w:spacing w:val="52"/>
+        </w:rPr>
+        <w:t>KAPITEL 1</w:t>
+      </w:r>
+    </w:p>
+    <w:p>
+      <w:pPr>
+        <w:spacing w:after="320"/>
+        <w:jc w:val="center"/>
+      </w:pPr>
+      <w:r>
+        <w:rPr>
+          <w:rFonts w:ascii="Georgia" w:hAnsi="Georgia"/>
           <w:b/>
-          <w:sz w:val="32"/>
-        </w:rPr>
-        <w:t>Das Geheimnis des Brunnens</w:t>
-      </w:r>
-    </w:p>
-    <w:p>
-      <w:pPr>
-        <w:spacing w:after="40"/>
+          <w:sz w:val="30"/>
+        </w:rPr>
+        <w:t>Der versiegelte Brief</w:t>
+      </w:r>
+    </w:p>
+    <w:p>
+      <w:pPr>
+        <w:spacing w:before="80" w:after="0"/>
+      </w:pPr>
+      <w:r>
+        <w:rPr>
+          <w:rFonts w:ascii="Georgia" w:hAnsi="Georgia"/>
+          <w:sz w:val="22"/>
+        </w:rPr>
+        <w:t>Jonas bremste.</w:t>
+      </w:r>
+    </w:p>
+    <w:p>
+      <w:pPr>
+        <w:spacing w:before="80" w:after="0"/>
+      </w:pPr>
+      <w:r>
+        <w:rPr>
+          <w:rFonts w:ascii="Georgia" w:hAnsi="Georgia"/>
+          <w:sz w:val="22"/>
+        </w:rPr>
+        <w:t>Sein Fahrrad rutschte über das Pflaster. Die Reifen quietschten. Er hielt direkt vor dem Brunnen.</w:t>
+      </w:r>
+    </w:p>
+    <w:p>
+      <w:pPr>
+        <w:spacing w:before="80" w:after="0"/>
+      </w:pPr>
+      <w:r>
+        <w:rPr>
+          <w:rFonts w:ascii="Georgia" w:hAnsi="Georgia"/>
+          <w:sz w:val="22"/>
+        </w:rPr>
+        <w:t>Das Wasser plätscherte. Die Sonne schien auf die steinernen Wände. Moosig und grün.</w:t>
+      </w:r>
+    </w:p>
+    <w:p>
+      <w:pPr>
+        <w:spacing w:before="80" w:after="0"/>
+      </w:pPr>
+      <w:r>
+        <w:rPr>
+          <w:rFonts w:ascii="Georgia" w:hAnsi="Georgia"/>
+          <w:sz w:val="22"/>
+        </w:rPr>
+        <w:t>„Vorsichtig, Jonas!" rief Frau Schneider. „Fast wärst du reingefahren!"</w:t>
+      </w:r>
+    </w:p>
+    <w:p>
+      <w:pPr>
+        <w:spacing w:before="80" w:after="0"/>
+      </w:pPr>
+      <w:r>
+        <w:rPr>
+          <w:rFonts w:ascii="Georgia" w:hAnsi="Georgia"/>
+          <w:sz w:val="22"/>
+        </w:rPr>
+        <w:t>„Entschuldigung", sagte Jonas.</w:t>
+      </w:r>
+    </w:p>
+    <w:p>
+      <w:pPr>
+        <w:spacing w:before="80" w:after="0"/>
+      </w:pPr>
+      <w:r>
+        <w:rPr>
+          <w:rFonts w:ascii="Georgia" w:hAnsi="Georgia"/>
+          <w:sz w:val="22"/>
+        </w:rPr>
+        <w:t>Aber er sah nicht Frau Schneider an. Er sah den Brunnen an. Wasser sprudelte aus einem Rohr. Steinerne Wände. Alles normal.</w:t>
+      </w:r>
+    </w:p>
+    <w:p>
+      <w:pPr>
+        <w:spacing w:before="80" w:after="0"/>
+      </w:pPr>
+      <w:r>
+        <w:rPr>
+          <w:rFonts w:ascii="Georgia" w:hAnsi="Georgia"/>
+          <w:sz w:val="22"/>
+        </w:rPr>
+        <w:t>Oder?</w:t>
+      </w:r>
+    </w:p>
+    <w:p>
+      <w:pPr>
+        <w:spacing w:before="80" w:after="0"/>
+      </w:pPr>
+      <w:r>
+        <w:rPr>
+          <w:rFonts w:ascii="Georgia" w:hAnsi="Georgia"/>
+          <w:sz w:val="22"/>
+        </w:rPr>
+        <w:t>Er dachte an das Foto aus der Schatzkammer. Eichenhain, 1952. Kein Brunnen. Nur Erde.</w:t>
+      </w:r>
+    </w:p>
+    <w:p>
+      <w:pPr>
+        <w:spacing w:before="80" w:after="0"/>
+      </w:pPr>
+      <w:r>
+        <w:rPr>
+          <w:rFonts w:ascii="Georgia" w:hAnsi="Georgia"/>
+          <w:sz w:val="22"/>
+        </w:rPr>
+        <w:t>„Warum stehst du so rum?" rief jemand.</w:t>
+      </w:r>
+    </w:p>
+    <w:p>
+      <w:pPr>
+        <w:spacing w:before="80" w:after="0"/>
+      </w:pPr>
+      <w:r>
+        <w:rPr>
+          <w:rFonts w:ascii="Georgia" w:hAnsi="Georgia"/>
+          <w:sz w:val="22"/>
+        </w:rPr>
+        <w:t>Jonas drehte sich um. Mila kam über den Marktplatz gerannt. Ben trottete hinter ihr her.</w:t>
+      </w:r>
+    </w:p>
+    <w:p>
+      <w:pPr>
+        <w:spacing w:before="80" w:after="0"/>
+      </w:pPr>
+      <w:r>
+        <w:rPr>
+          <w:rFonts w:ascii="Georgia" w:hAnsi="Georgia"/>
+          <w:sz w:val="22"/>
+        </w:rPr>
+        <w:t>„Ich stehe nicht rum", sagte Jonas. „Ich denke nach."</w:t>
+      </w:r>
+    </w:p>
+    <w:p>
+      <w:pPr>
+        <w:spacing w:before="80" w:after="0"/>
+      </w:pPr>
+      <w:r>
+        <w:rPr>
+          <w:rFonts w:ascii="Georgia" w:hAnsi="Georgia"/>
+          <w:sz w:val="22"/>
+        </w:rPr>
+        <w:t>„Über den Brunnen?" Mila blieb neben ihm stehen.</w:t>
+      </w:r>
+    </w:p>
+    <w:p>
+      <w:pPr>
+        <w:spacing w:before="80" w:after="0"/>
+      </w:pPr>
+      <w:r>
+        <w:rPr>
+          <w:rFonts w:ascii="Georgia" w:hAnsi="Georgia"/>
+          <w:sz w:val="22"/>
+        </w:rPr>
+        <w:t>Jonas nickte. „1952 gab es ihn noch nicht. Das Foto beweist es."</w:t>
+      </w:r>
+    </w:p>
+    <w:p>
+      <w:pPr>
+        <w:spacing w:before="80" w:after="0"/>
+      </w:pPr>
+      <w:r>
+        <w:rPr>
+          <w:rFonts w:ascii="Georgia" w:hAnsi="Georgia"/>
+          <w:sz w:val="22"/>
+        </w:rPr>
+        <w:t>„Und?" Ben schob seine rote Kappe zurecht. „Leute bauen Brunnen. Das ist normal."</w:t>
+      </w:r>
+    </w:p>
+    <w:p>
+      <w:pPr>
+        <w:spacing w:before="80" w:after="0"/>
+      </w:pPr>
+      <w:r>
+        <w:rPr>
+          <w:rFonts w:ascii="Georgia" w:hAnsi="Georgia"/>
+          <w:sz w:val="22"/>
+        </w:rPr>
+        <w:t>„Mitten auf dem Marktplatz?" Jonas schüttelte den Kopf. „Einfach so?"</w:t>
+      </w:r>
+    </w:p>
+    <w:p>
+      <w:pPr>
+        <w:spacing w:before="80" w:after="0"/>
+      </w:pPr>
+      <w:r>
+        <w:rPr>
+          <w:rFonts w:ascii="Georgia" w:hAnsi="Georgia"/>
+          <w:sz w:val="22"/>
+        </w:rPr>
+        <w:t>Ben zuckte die Schultern. „Vielleicht wollte jemand hübsches Wasser."</w:t>
+      </w:r>
+    </w:p>
+    <w:p>
+      <w:pPr>
+        <w:spacing w:before="80" w:after="0"/>
+      </w:pPr>
+      <w:r>
+        <w:rPr>
+          <w:rFonts w:ascii="Georgia" w:hAnsi="Georgia"/>
+          <w:sz w:val="22"/>
+        </w:rPr>
+        <w:t>„Hübsches Wasser?" Mila verdrehte die Augen.</w:t>
+      </w:r>
+    </w:p>
+    <w:p>
+      <w:pPr>
+        <w:spacing w:before="80" w:after="0"/>
+      </w:pPr>
+      <w:r>
+        <w:rPr>
+          <w:rFonts w:ascii="Georgia" w:hAnsi="Georgia"/>
+          <w:sz w:val="22"/>
+        </w:rPr>
+        <w:t>„Lass uns hoch zum Haus gehen", sagte Jonas. Er sah zum Hügel.</w:t>
+      </w:r>
+    </w:p>
+    <w:p>
+      <w:pPr>
+        <w:spacing w:before="120" w:after="120"/>
         <w:jc w:val="center"/>
       </w:pPr>
       <w:r>
         <w:rPr>
           <w:rFonts w:ascii="Georgia" w:hAnsi="Georgia"/>
-          <w:color w:val="646464"/>
-          <w:sz w:val="22"/>
-        </w:rPr>
-        <w:t>Kapitel 1</w:t>
-      </w:r>
-    </w:p>
-    <w:p>
-      <w:pPr>
-        <w:spacing w:after="280"/>
+          <w:sz w:val="22"/>
+        </w:rPr>
+        <w:t>* * *</w:t>
+      </w:r>
+    </w:p>
+    <w:p>
+      <w:pPr>
+        <w:spacing w:before="80" w:after="0"/>
+      </w:pPr>
+      <w:r>
+        <w:rPr>
+          <w:rFonts w:ascii="Georgia" w:hAnsi="Georgia"/>
+          <w:sz w:val="22"/>
+        </w:rPr>
+        <w:t>Das Herrenhaus sah anders aus.</w:t>
+      </w:r>
+    </w:p>
+    <w:p>
+      <w:pPr>
+        <w:spacing w:before="80" w:after="0"/>
+      </w:pPr>
+      <w:r>
+        <w:rPr>
+          <w:rFonts w:ascii="Georgia" w:hAnsi="Georgia"/>
+          <w:sz w:val="22"/>
+        </w:rPr>
+        <w:t>Gerüste an der Fassade. Planen über dem Dach. Hämmer klopften.</w:t>
+      </w:r>
+    </w:p>
+    <w:p>
+      <w:pPr>
+        <w:spacing w:before="80" w:after="0"/>
+      </w:pPr>
+      <w:r>
+        <w:rPr>
+          <w:rFonts w:ascii="Georgia" w:hAnsi="Georgia"/>
+          <w:sz w:val="22"/>
+        </w:rPr>
+        <w:t>Jonas ging den Feldweg hinauf. Vor drei Wochen war alles anders gewesen. Dunkle Fenster. Stille. Ein verbotenes Haus.</w:t>
+      </w:r>
+    </w:p>
+    <w:p>
+      <w:pPr>
+        <w:spacing w:before="80" w:after="0"/>
+      </w:pPr>
+      <w:r>
+        <w:rPr>
+          <w:rFonts w:ascii="Georgia" w:hAnsi="Georgia"/>
+          <w:sz w:val="22"/>
+        </w:rPr>
+        <w:t>Jetzt war es eine Baustelle. Laut und hell und voller Menschen.</w:t>
+      </w:r>
+    </w:p>
+    <w:p>
+      <w:pPr>
+        <w:spacing w:before="80" w:after="0"/>
+      </w:pPr>
+      <w:r>
+        <w:rPr>
+          <w:rFonts w:ascii="Georgia" w:hAnsi="Georgia"/>
+          <w:sz w:val="22"/>
+        </w:rPr>
+        <w:t>Vor dem Haus stand Herr Meier. Er trug ein Brett über der Schulter. Sein Gesicht war rot. Schweißtropfen auf der Stirn.</w:t>
+      </w:r>
+    </w:p>
+    <w:p>
+      <w:pPr>
+        <w:spacing w:before="80" w:after="0"/>
+      </w:pPr>
+      <w:r>
+        <w:rPr>
+          <w:rFonts w:ascii="Georgia" w:hAnsi="Georgia"/>
+          <w:sz w:val="22"/>
+        </w:rPr>
+        <w:t>„Morgen", sagte er. Kurz. Ohne Lächeln.</w:t>
+      </w:r>
+    </w:p>
+    <w:p>
+      <w:pPr>
+        <w:spacing w:before="80" w:after="0"/>
+      </w:pPr>
+      <w:r>
+        <w:rPr>
+          <w:rFonts w:ascii="Georgia" w:hAnsi="Georgia"/>
+          <w:sz w:val="22"/>
+        </w:rPr>
+        <w:t>„Morgen", sagte Jonas.</w:t>
+      </w:r>
+    </w:p>
+    <w:p>
+      <w:pPr>
+        <w:spacing w:before="80" w:after="0"/>
+      </w:pPr>
+      <w:r>
+        <w:rPr>
+          <w:rFonts w:ascii="Georgia" w:hAnsi="Georgia"/>
+          <w:sz w:val="22"/>
+        </w:rPr>
+        <w:t>Jonas schluckte. Meier hatte sie eingesperrt. Aber auch dreißig Jahre auf Winters Haus aufgepasst.</w:t>
+      </w:r>
+    </w:p>
+    <w:p>
+      <w:pPr>
+        <w:spacing w:before="80" w:after="0"/>
+      </w:pPr>
+      <w:r>
+        <w:rPr>
+          <w:rFonts w:ascii="Georgia" w:hAnsi="Georgia"/>
+          <w:sz w:val="22"/>
+        </w:rPr>
+        <w:t>Jonas ging am Gerüst vorbei.</w:t>
+      </w:r>
+    </w:p>
+    <w:p>
+      <w:pPr>
+        <w:spacing w:before="120" w:after="120"/>
         <w:jc w:val="center"/>
       </w:pPr>
       <w:r>
         <w:rPr>
           <w:rFonts w:ascii="Georgia" w:hAnsi="Georgia"/>
-          <w:b/>
-          <w:sz w:val="28"/>
-        </w:rPr>
-        <w:t>Der versiegelte Brief</w:t>
-      </w:r>
-    </w:p>
-    <w:p>
-      <w:pPr>
-        <w:spacing w:before="80" w:after="0"/>
-      </w:pPr>
-      <w:r>
-        <w:rPr>
-          <w:rFonts w:ascii="Georgia" w:hAnsi="Georgia"/>
-          <w:sz w:val="22"/>
-        </w:rPr>
-        <w:t>Der Brunnen plaetscherte.</w:t>
-      </w:r>
-    </w:p>
-    <w:p>
-      <w:pPr>
-        <w:spacing w:before="80" w:after="0"/>
-      </w:pPr>
-    </w:p>
-    <w:p>
-      <w:pPr>
-        <w:spacing w:before="80" w:after="0"/>
-      </w:pPr>
-      <w:r>
-        <w:rPr>
-          <w:rFonts w:ascii="Georgia" w:hAnsi="Georgia"/>
-          <w:sz w:val="22"/>
-        </w:rPr>
-        <w:t>Jonas blieb stehen. Er stand mitten auf dem Marktplatz. Die Sonne schien auf das Pflaster.</w:t>
-      </w:r>
-    </w:p>
-    <w:p>
-      <w:pPr>
-        <w:spacing w:before="80" w:after="0"/>
-      </w:pPr>
-    </w:p>
-    <w:p>
-      <w:pPr>
-        <w:spacing w:before="80" w:after="0"/>
-      </w:pPr>
-      <w:r>
-        <w:rPr>
-          <w:rFonts w:ascii="Georgia" w:hAnsi="Georgia"/>
-          <w:sz w:val="22"/>
-        </w:rPr>
-        <w:t>"Schoener Tag, nicht wahr?" rief Frau Schneider.</w:t>
-      </w:r>
-    </w:p>
-    <w:p>
-      <w:pPr>
-        <w:spacing w:before="80" w:after="0"/>
-      </w:pPr>
-    </w:p>
-    <w:p>
-      <w:pPr>
-        <w:spacing w:before="80" w:after="0"/>
-      </w:pPr>
-      <w:r>
-        <w:rPr>
-          <w:rFonts w:ascii="Georgia" w:hAnsi="Georgia"/>
-          <w:sz w:val="22"/>
-        </w:rPr>
-        <w:t>Jonas nickte. "Ja, sehr schoen."</w:t>
-      </w:r>
-    </w:p>
-    <w:p>
-      <w:pPr>
-        <w:spacing w:before="80" w:after="0"/>
-      </w:pPr>
-    </w:p>
-    <w:p>
-      <w:pPr>
-        <w:spacing w:before="80" w:after="0"/>
-      </w:pPr>
-      <w:r>
-        <w:rPr>
-          <w:rFonts w:ascii="Georgia" w:hAnsi="Georgia"/>
-          <w:sz w:val="22"/>
-        </w:rPr>
-        <w:t>"Du siehst so nachdenklich aus", sagte sie. "Ist alles in Ordnung?"</w:t>
-      </w:r>
-    </w:p>
-    <w:p>
-      <w:pPr>
-        <w:spacing w:before="80" w:after="0"/>
-      </w:pPr>
-    </w:p>
-    <w:p>
-      <w:pPr>
-        <w:spacing w:before="80" w:after="0"/>
-      </w:pPr>
-      <w:r>
-        <w:rPr>
-          <w:rFonts w:ascii="Georgia" w:hAnsi="Georgia"/>
-          <w:sz w:val="22"/>
-        </w:rPr>
-        <w:t>"Alles gut", sagte Jonas schnell.</w:t>
-      </w:r>
-    </w:p>
-    <w:p>
-      <w:pPr>
-        <w:spacing w:before="80" w:after="0"/>
-      </w:pPr>
-    </w:p>
-    <w:p>
-      <w:pPr>
-        <w:spacing w:before="80" w:after="0"/>
-      </w:pPr>
-      <w:r>
-        <w:rPr>
-          <w:rFonts w:ascii="Georgia" w:hAnsi="Georgia"/>
-          <w:sz w:val="22"/>
-        </w:rPr>
-        <w:t>Seine Stimme klang normal. Aber sein Blick hing am Brunnen. Steinerne Waende, moosig und gruen. Wasser sprudelte aus einem Rohr.</w:t>
-      </w:r>
-    </w:p>
-    <w:p>
-      <w:pPr>
-        <w:spacing w:before="80" w:after="0"/>
-      </w:pPr>
-    </w:p>
-    <w:p>
-      <w:pPr>
-        <w:spacing w:before="80" w:after="0"/>
-      </w:pPr>
-      <w:r>
-        <w:rPr>
-          <w:rFonts w:ascii="Georgia" w:hAnsi="Georgia"/>
-          <w:sz w:val="22"/>
-        </w:rPr>
-        <w:t>Er dachte an das Foto aus der Schatzkammer. Eichenhain, 1952. Kein Brunnen. Nur Erde.</w:t>
-      </w:r>
-    </w:p>
-    <w:p>
-      <w:pPr>
-        <w:spacing w:before="80" w:after="0"/>
-      </w:pPr>
-    </w:p>
-    <w:p>
-      <w:pPr>
-        <w:spacing w:before="80" w:after="0"/>
-      </w:pPr>
-      <w:r>
-        <w:rPr>
-          <w:rFonts w:ascii="Georgia" w:hAnsi="Georgia"/>
-          <w:sz w:val="22"/>
-        </w:rPr>
-        <w:t>"Warum stehst du so rum?" rief jemand.</w:t>
-      </w:r>
-    </w:p>
-    <w:p>
-      <w:pPr>
-        <w:spacing w:before="80" w:after="0"/>
-      </w:pPr>
-    </w:p>
-    <w:p>
-      <w:pPr>
-        <w:spacing w:before="80" w:after="0"/>
-      </w:pPr>
-      <w:r>
-        <w:rPr>
-          <w:rFonts w:ascii="Georgia" w:hAnsi="Georgia"/>
-          <w:sz w:val="22"/>
-        </w:rPr>
-        <w:t>Jonas drehte sich um. Mila kam ueber den Marktplatz gerannt. Ben trottete hinter ihr her.</w:t>
-      </w:r>
-    </w:p>
-    <w:p>
-      <w:pPr>
-        <w:spacing w:before="80" w:after="0"/>
-      </w:pPr>
-    </w:p>
-    <w:p>
-      <w:pPr>
-        <w:spacing w:before="80" w:after="0"/>
-      </w:pPr>
-      <w:r>
-        <w:rPr>
-          <w:rFonts w:ascii="Georgia" w:hAnsi="Georgia"/>
-          <w:sz w:val="22"/>
-        </w:rPr>
-        <w:t>"Ich stehe nicht rum", sagte Jonas. "Ich denke nach."</w:t>
-      </w:r>
-    </w:p>
-    <w:p>
-      <w:pPr>
-        <w:spacing w:before="80" w:after="0"/>
-      </w:pPr>
-    </w:p>
-    <w:p>
-      <w:pPr>
-        <w:spacing w:before="80" w:after="0"/>
-      </w:pPr>
-      <w:r>
-        <w:rPr>
-          <w:rFonts w:ascii="Georgia" w:hAnsi="Georgia"/>
-          <w:sz w:val="22"/>
-        </w:rPr>
-        <w:t>"Ueber den Brunnen?" Mila blieb neben ihm stehen.</w:t>
-      </w:r>
-    </w:p>
-    <w:p>
-      <w:pPr>
-        <w:spacing w:before="80" w:after="0"/>
-      </w:pPr>
-    </w:p>
-    <w:p>
-      <w:pPr>
-        <w:spacing w:before="80" w:after="0"/>
-      </w:pPr>
-      <w:r>
-        <w:rPr>
-          <w:rFonts w:ascii="Georgia" w:hAnsi="Georgia"/>
-          <w:sz w:val="22"/>
-        </w:rPr>
-        <w:t>Jonas nickte. "1952 gab es ihn noch nicht. Das Foto beweist es."</w:t>
-      </w:r>
-    </w:p>
-    <w:p>
-      <w:pPr>
-        <w:spacing w:before="80" w:after="0"/>
-      </w:pPr>
-    </w:p>
-    <w:p>
-      <w:pPr>
-        <w:spacing w:before="80" w:after="0"/>
-      </w:pPr>
-      <w:r>
-        <w:rPr>
-          <w:rFonts w:ascii="Georgia" w:hAnsi="Georgia"/>
-          <w:sz w:val="22"/>
-        </w:rPr>
-        <w:t>"Und?" Ben schob seine rote Kappe zurecht. "Leute bauen Brunnen. Das ist normal."</w:t>
-      </w:r>
-    </w:p>
-    <w:p>
-      <w:pPr>
-        <w:spacing w:before="80" w:after="0"/>
-      </w:pPr>
-    </w:p>
-    <w:p>
-      <w:pPr>
-        <w:spacing w:before="80" w:after="0"/>
-      </w:pPr>
-      <w:r>
-        <w:rPr>
-          <w:rFonts w:ascii="Georgia" w:hAnsi="Georgia"/>
-          <w:sz w:val="22"/>
-        </w:rPr>
-        <w:t>"Mitten auf dem Marktplatz?" Jonas schuettelte den Kopf. "Einfach so?"</w:t>
-      </w:r>
-    </w:p>
-    <w:p>
-      <w:pPr>
-        <w:spacing w:before="80" w:after="0"/>
-      </w:pPr>
-    </w:p>
-    <w:p>
-      <w:pPr>
-        <w:spacing w:before="80" w:after="0"/>
-      </w:pPr>
-      <w:r>
-        <w:rPr>
-          <w:rFonts w:ascii="Georgia" w:hAnsi="Georgia"/>
-          <w:sz w:val="22"/>
-        </w:rPr>
-        <w:t>Ben zuckte die Schultern. "Vielleicht wollte jemand huebsches Wasser."</w:t>
-      </w:r>
-    </w:p>
-    <w:p>
-      <w:pPr>
-        <w:spacing w:before="80" w:after="0"/>
-      </w:pPr>
-    </w:p>
-    <w:p>
-      <w:pPr>
-        <w:spacing w:before="80" w:after="0"/>
-      </w:pPr>
-      <w:r>
-        <w:rPr>
-          <w:rFonts w:ascii="Georgia" w:hAnsi="Georgia"/>
-          <w:sz w:val="22"/>
-        </w:rPr>
-        <w:t>"Huebsches Wasser?" Mila verdrehte die Augen.</w:t>
-      </w:r>
-    </w:p>
-    <w:p>
-      <w:pPr>
-        <w:spacing w:before="80" w:after="0"/>
-      </w:pPr>
-    </w:p>
-    <w:p>
-      <w:pPr>
-        <w:spacing w:before="80" w:after="0"/>
-      </w:pPr>
-      <w:r>
-        <w:rPr>
-          <w:rFonts w:ascii="Georgia" w:hAnsi="Georgia"/>
-          <w:sz w:val="22"/>
-        </w:rPr>
-        <w:t>"Lass uns hoch zum Haus gehen", sagte Jonas. Er sah zum Huegel.</w:t>
-      </w:r>
-    </w:p>
-    <w:p/>
-    <w:p>
-      <w:pPr>
-        <w:spacing w:before="120" w:after="280"/>
+          <w:sz w:val="22"/>
+        </w:rPr>
+        <w:t>* * *</w:t>
+      </w:r>
+    </w:p>
+    <w:p>
+      <w:pPr>
+        <w:spacing w:before="80" w:after="0"/>
+      </w:pPr>
+      <w:r>
+        <w:rPr>
+          <w:rFonts w:ascii="Georgia" w:hAnsi="Georgia"/>
+          <w:sz w:val="22"/>
+        </w:rPr>
+        <w:t>Mila saß auf einer Mauer hinter dem Haus. Ihre Beine baumelten. Neben ihr: Ben. Seine rote Kappe saß schief.</w:t>
+      </w:r>
+    </w:p>
+    <w:p>
+      <w:pPr>
+        <w:spacing w:before="80" w:after="0"/>
+      </w:pPr>
+      <w:r>
+        <w:rPr>
+          <w:rFonts w:ascii="Georgia" w:hAnsi="Georgia"/>
+          <w:sz w:val="22"/>
+        </w:rPr>
+        <w:t>„Da bist du ja", sagte Mila. „Wir warten seit einer Stunde."</w:t>
+      </w:r>
+    </w:p>
+    <w:p>
+      <w:pPr>
+        <w:spacing w:before="80" w:after="0"/>
+      </w:pPr>
+      <w:r>
+        <w:rPr>
+          <w:rFonts w:ascii="Georgia" w:hAnsi="Georgia"/>
+          <w:sz w:val="22"/>
+        </w:rPr>
+        <w:t>„Zwanzig Minuten", sagte Ben. „Aber es fühlt sich an wie eine Stunde."</w:t>
+      </w:r>
+    </w:p>
+    <w:p>
+      <w:pPr>
+        <w:spacing w:before="80" w:after="0"/>
+      </w:pPr>
+      <w:r>
+        <w:rPr>
+          <w:rFonts w:ascii="Georgia" w:hAnsi="Georgia"/>
+          <w:sz w:val="22"/>
+        </w:rPr>
+        <w:t>Jonas setzte sich neben sie. Von hier oben sah der Brunnen klein aus. Harmlos.</w:t>
+      </w:r>
+    </w:p>
+    <w:p>
+      <w:pPr>
+        <w:spacing w:before="80" w:after="0"/>
+      </w:pPr>
+      <w:r>
+        <w:rPr>
+          <w:rFonts w:ascii="Georgia" w:hAnsi="Georgia"/>
+          <w:sz w:val="22"/>
+        </w:rPr>
+        <w:t>„Immer noch der Brunnen?" fragte Ben. Er kaute auf einem Grashalm.</w:t>
+      </w:r>
+    </w:p>
+    <w:p>
+      <w:pPr>
+        <w:spacing w:before="80" w:after="0"/>
+      </w:pPr>
+      <w:r>
+        <w:rPr>
+          <w:rFonts w:ascii="Georgia" w:hAnsi="Georgia"/>
+          <w:sz w:val="22"/>
+        </w:rPr>
+        <w:t>Jonas nickte. „Winter hat extra darüber geschrieben. Das muss was bedeuten."</w:t>
+      </w:r>
+    </w:p>
+    <w:p>
+      <w:pPr>
+        <w:spacing w:before="80" w:after="0"/>
+      </w:pPr>
+      <w:r>
+        <w:rPr>
+          <w:rFonts w:ascii="Georgia" w:hAnsi="Georgia"/>
+          <w:sz w:val="22"/>
+        </w:rPr>
+        <w:t>Er sah zum Herrenhaus. „Was macht Meier da drin?"</w:t>
+      </w:r>
+    </w:p>
+    <w:p>
+      <w:pPr>
+        <w:spacing w:before="80" w:after="0"/>
+      </w:pPr>
+      <w:r>
+        <w:rPr>
+          <w:rFonts w:ascii="Georgia" w:hAnsi="Georgia"/>
+          <w:sz w:val="22"/>
+        </w:rPr>
+        <w:t>„Trägt Schutt raus." Ben spuckte seinen Grashalm aus. „Seit zwei Stunden. Ohne Pause. Der Mann ist eine Maschine."</w:t>
+      </w:r>
+    </w:p>
+    <w:p>
+      <w:pPr>
+        <w:spacing w:before="80" w:after="0"/>
+      </w:pPr>
+      <w:r>
+        <w:rPr>
+          <w:rFonts w:ascii="Georgia" w:hAnsi="Georgia"/>
+          <w:sz w:val="22"/>
+        </w:rPr>
+        <w:t>„Er hat ein schlechtes Gewissen", sagte Mila. „Deswegen arbeitet er so viel."</w:t>
+      </w:r>
+    </w:p>
+    <w:p>
+      <w:pPr>
+        <w:spacing w:before="80" w:after="0"/>
+      </w:pPr>
+      <w:r>
+        <w:rPr>
+          <w:rFonts w:ascii="Georgia" w:hAnsi="Georgia"/>
+          <w:sz w:val="22"/>
+        </w:rPr>
+        <w:t>„Trotzdem gruselig", murmelte Ben. „Letzte Woche hat er mich angestarrt. Einfach so. Zehn Sekunden lang."</w:t>
+      </w:r>
+    </w:p>
+    <w:p>
+      <w:pPr>
+        <w:spacing w:before="80" w:after="0"/>
+      </w:pPr>
+      <w:r>
+        <w:rPr>
+          <w:rFonts w:ascii="Georgia" w:hAnsi="Georgia"/>
+          <w:sz w:val="22"/>
+        </w:rPr>
+        <w:t>Mila verdrehte die Augen. „Er hat dir zugenickt, Ben."</w:t>
+      </w:r>
+    </w:p>
+    <w:p>
+      <w:pPr>
+        <w:spacing w:before="80" w:after="0"/>
+      </w:pPr>
+      <w:r>
+        <w:rPr>
+          <w:rFonts w:ascii="Georgia" w:hAnsi="Georgia"/>
+          <w:sz w:val="22"/>
+        </w:rPr>
+        <w:t>„Das WAR ein Starren." Ben zog seine Kappe tiefer. „Ein gruseliges Nicken. Es gibt gruseliges Nicken, wisst ihr."</w:t>
+      </w:r>
+    </w:p>
+    <w:p>
+      <w:pPr>
+        <w:spacing w:before="80" w:after="0"/>
+      </w:pPr>
+      <w:r>
+        <w:rPr>
+          <w:rFonts w:ascii="Georgia" w:hAnsi="Georgia"/>
+          <w:sz w:val="22"/>
+        </w:rPr>
+        <w:t>„Gibt es nicht", sagte Mila.</w:t>
+      </w:r>
+    </w:p>
+    <w:p>
+      <w:pPr>
+        <w:spacing w:before="80" w:after="0"/>
+      </w:pPr>
+      <w:r>
+        <w:rPr>
+          <w:rFonts w:ascii="Georgia" w:hAnsi="Georgia"/>
+          <w:sz w:val="22"/>
+        </w:rPr>
+        <w:t>„Gibt es wohl."</w:t>
+      </w:r>
+    </w:p>
+    <w:p>
+      <w:pPr>
+        <w:spacing w:before="80" w:after="0"/>
+      </w:pPr>
+      <w:r>
+        <w:rPr>
+          <w:rFonts w:ascii="Georgia" w:hAnsi="Georgia"/>
+          <w:sz w:val="22"/>
+        </w:rPr>
+        <w:t>„Gibt es nicht."</w:t>
+      </w:r>
+    </w:p>
+    <w:p>
+      <w:pPr>
+        <w:spacing w:before="80" w:after="0"/>
+      </w:pPr>
+      <w:r>
+        <w:rPr>
+          <w:rFonts w:ascii="Georgia" w:hAnsi="Georgia"/>
+          <w:sz w:val="22"/>
+        </w:rPr>
+        <w:t>„Ich schwor's euch. Seine Augen haben sich nicht bewegt. Wie bei einer Puppe."</w:t>
+      </w:r>
+    </w:p>
+    <w:p>
+      <w:pPr>
+        <w:spacing w:before="80" w:after="0"/>
+      </w:pPr>
+      <w:r>
+        <w:rPr>
+          <w:rFonts w:ascii="Georgia" w:hAnsi="Georgia"/>
+          <w:sz w:val="22"/>
+        </w:rPr>
+        <w:t>Jonas lachte. „Er ist kein Roboter, Ben."</w:t>
+      </w:r>
+    </w:p>
+    <w:p>
+      <w:pPr>
+        <w:spacing w:before="80" w:after="0"/>
+      </w:pPr>
+      <w:r>
+        <w:rPr>
+          <w:rFonts w:ascii="Georgia" w:hAnsi="Georgia"/>
+          <w:sz w:val="22"/>
+        </w:rPr>
+        <w:t>„Das weißt du nicht sicher", sagte Ben. „Vielleicht ist er ein Roboter mit schlechtem Gewissen."</w:t>
+      </w:r>
+    </w:p>
+    <w:p>
+      <w:pPr>
+        <w:spacing w:before="80" w:after="0"/>
+      </w:pPr>
+      <w:r>
+        <w:rPr>
+          <w:rFonts w:ascii="Georgia" w:hAnsi="Georgia"/>
+          <w:sz w:val="22"/>
+        </w:rPr>
+        <w:t>Mila schüttelte den Kopf. „Du bist unmöglich."</w:t>
+      </w:r>
+    </w:p>
+    <w:p>
+      <w:pPr>
+        <w:spacing w:before="80" w:after="0"/>
+      </w:pPr>
+      <w:r>
+        <w:rPr>
+          <w:rFonts w:ascii="Georgia" w:hAnsi="Georgia"/>
+          <w:sz w:val="22"/>
+        </w:rPr>
+        <w:t>„Danke", sagte Ben. „Das war ein Kompliment, oder?"</w:t>
+      </w:r>
+    </w:p>
+    <w:p>
+      <w:pPr>
+        <w:spacing w:before="80" w:after="0"/>
+      </w:pPr>
+      <w:r>
+        <w:rPr>
+          <w:rFonts w:ascii="Georgia" w:hAnsi="Georgia"/>
+          <w:sz w:val="22"/>
+        </w:rPr>
+        <w:t>„Nein", sagte Mila.</w:t>
+      </w:r>
+    </w:p>
+    <w:p>
+      <w:pPr>
+        <w:spacing w:before="80" w:after="0"/>
+      </w:pPr>
+      <w:r>
+        <w:rPr>
+          <w:rFonts w:ascii="Georgia" w:hAnsi="Georgia"/>
+          <w:sz w:val="22"/>
+        </w:rPr>
+        <w:t>Jonas sah zum Brunnen hinunter. Von hier oben konnte man den Marktplatz sehen. Den Brunnen. Die alte Eiche.</w:t>
+      </w:r>
+    </w:p>
+    <w:p>
+      <w:pPr>
+        <w:spacing w:before="80" w:after="0"/>
+      </w:pPr>
+      <w:r>
+        <w:rPr>
+          <w:rFonts w:ascii="Georgia" w:hAnsi="Georgia"/>
+          <w:sz w:val="22"/>
+        </w:rPr>
+        <w:t>Sein Magen kribbelte.</w:t>
+      </w:r>
+    </w:p>
+    <w:p>
+      <w:pPr>
+        <w:spacing w:before="80" w:after="0"/>
+      </w:pPr>
+      <w:r>
+        <w:rPr>
+          <w:rFonts w:ascii="Georgia" w:hAnsi="Georgia"/>
+          <w:sz w:val="22"/>
+        </w:rPr>
+        <w:t>„Wir müssen über den Brief reden", sagte Mila.</w:t>
+      </w:r>
+    </w:p>
+    <w:p>
+      <w:pPr>
+        <w:spacing w:before="80" w:after="0"/>
+      </w:pPr>
+      <w:r>
+        <w:rPr>
+          <w:rFonts w:ascii="Georgia" w:hAnsi="Georgia"/>
+          <w:sz w:val="22"/>
+        </w:rPr>
+        <w:t>Jonas' Herz machte einen Sprung. Er hatte gewusst, dass dieser Moment kommen würde. Mila hatte es schon letzte Woche gesagt. Und die Woche davor. Jedes Mal der gleiche Satz.</w:t>
+      </w:r>
+    </w:p>
+    <w:p>
+      <w:pPr>
+        <w:spacing w:before="120" w:after="120"/>
         <w:jc w:val="center"/>
       </w:pPr>
       <w:r>
@@ -36487,16 +36905,617 @@
     </w:p>
     <w:p>
       <w:pPr>
-        <w:spacing w:after="160"/>
+        <w:spacing w:before="80" w:after="0"/>
+      </w:pPr>
+      <w:r>
+        <w:rPr>
+          <w:rFonts w:ascii="Georgia" w:hAnsi="Georgia"/>
+          <w:sz w:val="22"/>
+        </w:rPr>
+        <w:t>„Nicht schon wieder", stöhnte Ben.</w:t>
+      </w:r>
+    </w:p>
+    <w:p>
+      <w:pPr>
+        <w:spacing w:before="80" w:after="0"/>
+      </w:pPr>
+      <w:r>
+        <w:rPr>
+          <w:rFonts w:ascii="Georgia" w:hAnsi="Georgia"/>
+          <w:sz w:val="22"/>
+        </w:rPr>
+        <w:t>„Doch." Mila verschränkte die Arme. „Drei Wochen, Ben. Der Brief liegt seit drei Wochen in Jonas' Rucksack. Ungeöffnet."</w:t>
+      </w:r>
+    </w:p>
+    <w:p>
+      <w:pPr>
+        <w:spacing w:before="80" w:after="0"/>
+      </w:pPr>
+      <w:r>
+        <w:rPr>
+          <w:rFonts w:ascii="Georgia" w:hAnsi="Georgia"/>
+          <w:sz w:val="22"/>
+        </w:rPr>
+        <w:t>„Vielleicht aus gutem Grund", sagte Ben.</w:t>
+      </w:r>
+    </w:p>
+    <w:p>
+      <w:pPr>
+        <w:spacing w:before="80" w:after="0"/>
+      </w:pPr>
+      <w:r>
+        <w:rPr>
+          <w:rFonts w:ascii="Georgia" w:hAnsi="Georgia"/>
+          <w:sz w:val="22"/>
+        </w:rPr>
+        <w:t>„Aus welchem Grund?"</w:t>
+      </w:r>
+    </w:p>
+    <w:p>
+      <w:pPr>
+        <w:spacing w:before="80" w:after="0"/>
+      </w:pPr>
+      <w:r>
+        <w:rPr>
+          <w:rFonts w:ascii="Georgia" w:hAnsi="Georgia"/>
+          <w:sz w:val="22"/>
+        </w:rPr>
+        <w:t>„Weil da etwas Schlimmes drinsteht?" Ben zog seine Kappe noch tiefer. „Winter hatte viele Geheimnisse. Und nicht alle waren nett."</w:t>
+      </w:r>
+    </w:p>
+    <w:p>
+      <w:pPr>
+        <w:spacing w:before="80" w:after="0"/>
+      </w:pPr>
+      <w:r>
+        <w:rPr>
+          <w:rFonts w:ascii="Georgia" w:hAnsi="Georgia"/>
+          <w:sz w:val="22"/>
+        </w:rPr>
+        <w:t>„Quatsch." Mila sprang von der Mauer. „Dann müssen wir es erst recht wissen."</w:t>
+      </w:r>
+    </w:p>
+    <w:p>
+      <w:pPr>
+        <w:spacing w:before="80" w:after="0"/>
+      </w:pPr>
+      <w:r>
+        <w:rPr>
+          <w:rFonts w:ascii="Georgia" w:hAnsi="Georgia"/>
+          <w:sz w:val="22"/>
+        </w:rPr>
+        <w:t>„Oder erst recht NICHT."</w:t>
+      </w:r>
+    </w:p>
+    <w:p>
+      <w:pPr>
+        <w:spacing w:before="80" w:after="0"/>
+      </w:pPr>
+      <w:r>
+        <w:rPr>
+          <w:rFonts w:ascii="Georgia" w:hAnsi="Georgia"/>
+          <w:sz w:val="22"/>
+        </w:rPr>
+        <w:t>„Ben."</w:t>
+      </w:r>
+    </w:p>
+    <w:p>
+      <w:pPr>
+        <w:spacing w:before="80" w:after="0"/>
+      </w:pPr>
+      <w:r>
+        <w:rPr>
+          <w:rFonts w:ascii="Georgia" w:hAnsi="Georgia"/>
+          <w:sz w:val="22"/>
+        </w:rPr>
+        <w:t>„Mila."</w:t>
+      </w:r>
+    </w:p>
+    <w:p>
+      <w:pPr>
+        <w:spacing w:before="80" w:after="0"/>
+      </w:pPr>
+      <w:r>
+        <w:rPr>
+          <w:rFonts w:ascii="Georgia" w:hAnsi="Georgia"/>
+          <w:sz w:val="22"/>
+        </w:rPr>
+        <w:t>Sie starrten sich an. Wie immer. Mila mit verschränkten Armen. Ben mit gesenktem Kopf.</w:t>
+      </w:r>
+    </w:p>
+    <w:p>
+      <w:pPr>
+        <w:spacing w:before="80" w:after="0"/>
+      </w:pPr>
+      <w:r>
+        <w:rPr>
+          <w:rFonts w:ascii="Georgia" w:hAnsi="Georgia"/>
+          <w:sz w:val="22"/>
+        </w:rPr>
+        <w:t>Jonas spürte den Rucksack an seinem Rücken. Den Brief darin. Das harte Wachssiegel.</w:t>
+      </w:r>
+    </w:p>
+    <w:p>
+      <w:pPr>
+        <w:spacing w:before="80" w:after="0"/>
+      </w:pPr>
+      <w:r>
+        <w:rPr>
+          <w:rFonts w:ascii="Georgia" w:hAnsi="Georgia"/>
+          <w:sz w:val="22"/>
+        </w:rPr>
+        <w:t>„Warum hast du Angst vor dem Brief?" fragte Jonas.</w:t>
+      </w:r>
+    </w:p>
+    <w:p>
+      <w:pPr>
+        <w:spacing w:before="80" w:after="0"/>
+      </w:pPr>
+      <w:r>
+        <w:rPr>
+          <w:rFonts w:ascii="Georgia" w:hAnsi="Georgia"/>
+          <w:sz w:val="22"/>
+        </w:rPr>
+        <w:t>Ben blinzelte. „Ich hab keine Angst. Ich bin nur... vorsichtig. Das ist was anderes."</w:t>
+      </w:r>
+    </w:p>
+    <w:p>
+      <w:pPr>
+        <w:spacing w:before="80" w:after="0"/>
+      </w:pPr>
+      <w:r>
+        <w:rPr>
+          <w:rFonts w:ascii="Georgia" w:hAnsi="Georgia"/>
+          <w:sz w:val="22"/>
+        </w:rPr>
+        <w:t>„Das ist genau das Gleiche", sagte Mila.</w:t>
+      </w:r>
+    </w:p>
+    <w:p>
+      <w:pPr>
+        <w:spacing w:before="80" w:after="0"/>
+      </w:pPr>
+      <w:r>
+        <w:rPr>
+          <w:rFonts w:ascii="Georgia" w:hAnsi="Georgia"/>
+          <w:sz w:val="22"/>
+        </w:rPr>
+        <w:t>„Ist es nicht!" Ben sprang auf. „Vorsichtige Leute leben länger. Habt ihr das gewusst?"</w:t>
+      </w:r>
+    </w:p>
+    <w:p>
+      <w:pPr>
+        <w:spacing w:before="80" w:after="0"/>
+      </w:pPr>
+      <w:r>
+        <w:rPr>
+          <w:rFonts w:ascii="Georgia" w:hAnsi="Georgia"/>
+          <w:sz w:val="22"/>
+        </w:rPr>
+        <w:t>„Wo hast du das her?" fragte Jonas.</w:t>
+      </w:r>
+    </w:p>
+    <w:p>
+      <w:pPr>
+        <w:spacing w:before="80" w:after="0"/>
+      </w:pPr>
+      <w:r>
+        <w:rPr>
+          <w:rFonts w:ascii="Georgia" w:hAnsi="Georgia"/>
+          <w:sz w:val="22"/>
+        </w:rPr>
+        <w:t>„Mein Opa sagt das immer."</w:t>
+      </w:r>
+    </w:p>
+    <w:p>
+      <w:pPr>
+        <w:spacing w:before="80" w:after="0"/>
+      </w:pPr>
+      <w:r>
+        <w:rPr>
+          <w:rFonts w:ascii="Georgia" w:hAnsi="Georgia"/>
+          <w:sz w:val="22"/>
+        </w:rPr>
+        <w:t>Mila schnaubte. „Dein Opa sammelt Briefmarken, Ben."</w:t>
+      </w:r>
+    </w:p>
+    <w:p>
+      <w:pPr>
+        <w:spacing w:before="80" w:after="0"/>
+      </w:pPr>
+      <w:r>
+        <w:rPr>
+          <w:rFonts w:ascii="Georgia" w:hAnsi="Georgia"/>
+          <w:sz w:val="22"/>
+        </w:rPr>
+        <w:t>„Na und? Er lebt noch. Beweist meinen Punkt."</w:t>
+      </w:r>
+    </w:p>
+    <w:p>
+      <w:pPr>
+        <w:spacing w:before="80" w:after="0"/>
+      </w:pPr>
+      <w:r>
+        <w:rPr>
+          <w:rFonts w:ascii="Georgia" w:hAnsi="Georgia"/>
+          <w:sz w:val="22"/>
+        </w:rPr>
+        <w:t>Jonas schüttelte den Kopf. Er dachte an den Tunnel. An die Schatzkammer. An die Metalltür mit dem Stern-Symbol.</w:t>
+      </w:r>
+    </w:p>
+    <w:p>
+      <w:pPr>
+        <w:spacing w:before="80" w:after="0"/>
+      </w:pPr>
+      <w:r>
+        <w:rPr>
+          <w:rFonts w:ascii="Georgia" w:hAnsi="Georgia"/>
+          <w:sz w:val="22"/>
+        </w:rPr>
+        <w:t>„Ich will es wissen", sagte Jonas leise.</w:t>
+      </w:r>
+    </w:p>
+    <w:p>
+      <w:pPr>
+        <w:spacing w:before="80" w:after="0"/>
+      </w:pPr>
+      <w:r>
+        <w:rPr>
+          <w:rFonts w:ascii="Georgia" w:hAnsi="Georgia"/>
+          <w:sz w:val="22"/>
+        </w:rPr>
+        <w:t>Mila grinste breit. „Zwei gegen eins."</w:t>
+      </w:r>
+    </w:p>
+    <w:p>
+      <w:pPr>
+        <w:spacing w:before="80" w:after="0"/>
+      </w:pPr>
+      <w:r>
+        <w:rPr>
+          <w:rFonts w:ascii="Georgia" w:hAnsi="Georgia"/>
+          <w:sz w:val="22"/>
+        </w:rPr>
+        <w:t>Ben sah Jonas an. Dann Mila. Dann wieder Jonas.</w:t>
+      </w:r>
+    </w:p>
+    <w:p>
+      <w:pPr>
+        <w:spacing w:before="80" w:after="0"/>
+      </w:pPr>
+      <w:r>
+        <w:rPr>
+          <w:rFonts w:ascii="Georgia" w:hAnsi="Georgia"/>
+          <w:sz w:val="22"/>
+        </w:rPr>
+        <w:t>„Na gut", seufzte Ben. „Aber wenn da etwas Gruseliges drinsteht, sage ich: Ich hab's euch gesagt."</w:t>
+      </w:r>
+    </w:p>
+    <w:p>
+      <w:pPr>
+        <w:spacing w:before="80" w:after="0"/>
+      </w:pPr>
+      <w:r>
+        <w:rPr>
+          <w:rFonts w:ascii="Georgia" w:hAnsi="Georgia"/>
+          <w:sz w:val="22"/>
+        </w:rPr>
+        <w:t>„Abgemacht", sagte Jonas.</w:t>
+      </w:r>
+    </w:p>
+    <w:p>
+      <w:pPr>
+        <w:spacing w:before="80" w:after="0"/>
+      </w:pPr>
+      <w:r>
+        <w:rPr>
+          <w:rFonts w:ascii="Georgia" w:hAnsi="Georgia"/>
+          <w:sz w:val="22"/>
+        </w:rPr>
+        <w:t>„Ich meine es ernst. Ich werde es jeden Tag sagen. Beim Frühstück. Beim Mittagessen. Beim Abendessen."</w:t>
+      </w:r>
+    </w:p>
+    <w:p>
+      <w:pPr>
+        <w:spacing w:before="80" w:after="0"/>
+      </w:pPr>
+      <w:r>
+        <w:rPr>
+          <w:rFonts w:ascii="Georgia" w:hAnsi="Georgia"/>
+          <w:sz w:val="22"/>
+        </w:rPr>
+        <w:t>„Wir haben verstanden, Ben", sagte Mila.</w:t>
+      </w:r>
+    </w:p>
+    <w:p>
+      <w:pPr>
+        <w:spacing w:before="80" w:after="0"/>
+      </w:pPr>
+      <w:r>
+        <w:rPr>
+          <w:rFonts w:ascii="Georgia" w:hAnsi="Georgia"/>
+          <w:sz w:val="22"/>
+        </w:rPr>
+        <w:t>Jonas holte den Rucksack von der Schulter. Seine Finger wurden kalt. Nur ein bisschen.</w:t>
+      </w:r>
+    </w:p>
+    <w:p>
+      <w:pPr>
+        <w:spacing w:before="120" w:after="120"/>
         <w:jc w:val="center"/>
       </w:pPr>
       <w:r>
         <w:rPr>
           <w:rFonts w:ascii="Georgia" w:hAnsi="Georgia"/>
-          <w:b/>
-          <w:sz w:val="26"/>
-        </w:rPr>
-        <w:t>Wie geht es weiter?</w:t>
+          <w:sz w:val="22"/>
+        </w:rPr>
+        <w:t>* * *</w:t>
+      </w:r>
+    </w:p>
+    <w:p>
+      <w:pPr>
+        <w:spacing w:before="80" w:after="0"/>
+      </w:pPr>
+      <w:r>
+        <w:rPr>
+          <w:rFonts w:ascii="Georgia" w:hAnsi="Georgia"/>
+          <w:sz w:val="22"/>
+        </w:rPr>
+        <w:t>Die drei saßen im Kreis auf dem Boden. Hinter dem Herrenhaus. Im Schatten der Mauer.</w:t>
+      </w:r>
+    </w:p>
+    <w:p>
+      <w:pPr>
+        <w:spacing w:before="80" w:after="0"/>
+      </w:pPr>
+      <w:r>
+        <w:rPr>
+          <w:rFonts w:ascii="Georgia" w:hAnsi="Georgia"/>
+          <w:sz w:val="22"/>
+        </w:rPr>
+        <w:t>Jonas öffnete den Reißverschluss.</w:t>
+      </w:r>
+    </w:p>
+    <w:p>
+      <w:pPr>
+        <w:spacing w:before="80" w:after="0"/>
+      </w:pPr>
+      <w:r>
+        <w:rPr>
+          <w:rFonts w:ascii="Georgia" w:hAnsi="Georgia"/>
+          <w:sz w:val="22"/>
+        </w:rPr>
+        <w:t>Zwischen einem Apfel und einer Trinkflasche lag der Umschlag. Dick. Gelblich. Das rote Wachssiegel glänzte.</w:t>
+      </w:r>
+    </w:p>
+    <w:p>
+      <w:pPr>
+        <w:spacing w:before="80" w:after="0"/>
+      </w:pPr>
+      <w:r>
+        <w:rPr>
+          <w:rFonts w:ascii="Georgia" w:hAnsi="Georgia"/>
+          <w:sz w:val="22"/>
+        </w:rPr>
+        <w:t>Jonas nahm ihn heraus. Der Umschlag war schwer. Schwerer als ein normaler Brief.</w:t>
+      </w:r>
+    </w:p>
+    <w:p>
+      <w:pPr>
+        <w:spacing w:before="80" w:after="0"/>
+      </w:pPr>
+      <w:r>
+        <w:rPr>
+          <w:rFonts w:ascii="Georgia" w:hAnsi="Georgia"/>
+          <w:sz w:val="22"/>
+        </w:rPr>
+        <w:t>„Der sieht uralt aus", flüsterte Ben. „Wie hundert Jahre alt."</w:t>
+      </w:r>
+    </w:p>
+    <w:p>
+      <w:pPr>
+        <w:spacing w:before="80" w:after="0"/>
+      </w:pPr>
+      <w:r>
+        <w:rPr>
+          <w:rFonts w:ascii="Georgia" w:hAnsi="Georgia"/>
+          <w:sz w:val="22"/>
+        </w:rPr>
+        <w:t>„So alt ist er nicht", sagte Mila.</w:t>
+      </w:r>
+    </w:p>
+    <w:p>
+      <w:pPr>
+        <w:spacing w:before="80" w:after="0"/>
+      </w:pPr>
+      <w:r>
+        <w:rPr>
+          <w:rFonts w:ascii="Georgia" w:hAnsi="Georgia"/>
+          <w:sz w:val="22"/>
+        </w:rPr>
+        <w:t>„Woher willst du das wissen?"</w:t>
+      </w:r>
+    </w:p>
+    <w:p>
+      <w:pPr>
+        <w:spacing w:before="80" w:after="0"/>
+      </w:pPr>
+      <w:r>
+        <w:rPr>
+          <w:rFonts w:ascii="Georgia" w:hAnsi="Georgia"/>
+          <w:sz w:val="22"/>
+        </w:rPr>
+        <w:t>„Weil Winter erst letztes Jahr gestorben ist, Ben."</w:t>
+      </w:r>
+    </w:p>
+    <w:p>
+      <w:pPr>
+        <w:spacing w:before="80" w:after="0"/>
+      </w:pPr>
+      <w:r>
+        <w:rPr>
+          <w:rFonts w:ascii="Georgia" w:hAnsi="Georgia"/>
+          <w:sz w:val="22"/>
+        </w:rPr>
+        <w:t>Ben wurde rot. „Ich meinte das Papier."</w:t>
+      </w:r>
+    </w:p>
+    <w:p>
+      <w:pPr>
+        <w:spacing w:before="80" w:after="0"/>
+      </w:pPr>
+      <w:r>
+        <w:rPr>
+          <w:rFonts w:ascii="Georgia" w:hAnsi="Georgia"/>
+          <w:sz w:val="22"/>
+        </w:rPr>
+        <w:t>„Ist er auch", sagte Mila. „Riech mal. Wie Kerzenwachs."</w:t>
+      </w:r>
+    </w:p>
+    <w:p>
+      <w:pPr>
+        <w:spacing w:before="80" w:after="0"/>
+      </w:pPr>
+      <w:r>
+        <w:rPr>
+          <w:rFonts w:ascii="Georgia" w:hAnsi="Georgia"/>
+          <w:sz w:val="22"/>
+        </w:rPr>
+        <w:t>„Seid ihr sicher?" fragte Jonas.</w:t>
+      </w:r>
+    </w:p>
+    <w:p>
+      <w:pPr>
+        <w:spacing w:before="80" w:after="0"/>
+      </w:pPr>
+      <w:r>
+        <w:rPr>
+          <w:rFonts w:ascii="Georgia" w:hAnsi="Georgia"/>
+          <w:sz w:val="22"/>
+        </w:rPr>
+        <w:t>„Ja", sagte Mila sofort.</w:t>
+      </w:r>
+    </w:p>
+    <w:p>
+      <w:pPr>
+        <w:spacing w:before="80" w:after="0"/>
+      </w:pPr>
+      <w:r>
+        <w:rPr>
+          <w:rFonts w:ascii="Georgia" w:hAnsi="Georgia"/>
+          <w:sz w:val="22"/>
+        </w:rPr>
+        <w:t>„Nein", sagte Ben. „Aber macht schon."</w:t>
+      </w:r>
+    </w:p>
+    <w:p>
+      <w:pPr>
+        <w:spacing w:before="80" w:after="0"/>
+      </w:pPr>
+      <w:r>
+        <w:rPr>
+          <w:rFonts w:ascii="Georgia" w:hAnsi="Georgia"/>
+          <w:sz w:val="22"/>
+        </w:rPr>
+        <w:t>Jonas drehte den Umschlag um. Das Siegel war dunkelrot.</w:t>
+      </w:r>
+    </w:p>
+    <w:p>
+      <w:pPr>
+        <w:spacing w:before="80" w:after="0"/>
+      </w:pPr>
+      <w:r>
+        <w:rPr>
+          <w:rFonts w:ascii="Georgia" w:hAnsi="Georgia"/>
+          <w:sz w:val="22"/>
+        </w:rPr>
+        <w:t>„Sieht aus wie Blut", sagte Ben.</w:t>
+      </w:r>
+    </w:p>
+    <w:p>
+      <w:pPr>
+        <w:spacing w:before="80" w:after="0"/>
+      </w:pPr>
+      <w:r>
+        <w:rPr>
+          <w:rFonts w:ascii="Georgia" w:hAnsi="Georgia"/>
+          <w:sz w:val="22"/>
+        </w:rPr>
+        <w:t>„Wie Kirschen", sagte Jonas.</w:t>
+      </w:r>
+    </w:p>
+    <w:p>
+      <w:pPr>
+        <w:spacing w:before="80" w:after="0"/>
+      </w:pPr>
+      <w:r>
+        <w:rPr>
+          <w:rFonts w:ascii="Georgia" w:hAnsi="Georgia"/>
+          <w:sz w:val="22"/>
+        </w:rPr>
+        <w:t>„Gruselige Kirschen", murmelte Ben.</w:t>
+      </w:r>
+    </w:p>
+    <w:p>
+      <w:pPr>
+        <w:spacing w:before="80" w:after="0"/>
+      </w:pPr>
+      <w:r>
+        <w:rPr>
+          <w:rFonts w:ascii="Georgia" w:hAnsi="Georgia"/>
+          <w:sz w:val="22"/>
+        </w:rPr>
+        <w:t>Jonas schob den Daumen unter das Wachs. Drückte.</w:t>
+      </w:r>
+    </w:p>
+    <w:p>
+      <w:pPr>
+        <w:spacing w:before="80" w:after="0"/>
+      </w:pPr>
+      <w:r>
+        <w:rPr>
+          <w:rFonts w:ascii="Georgia" w:hAnsi="Georgia"/>
+          <w:sz w:val="22"/>
+        </w:rPr>
+        <w:t>Knack.</w:t>
+      </w:r>
+    </w:p>
+    <w:p>
+      <w:pPr>
+        <w:spacing w:before="80" w:after="0"/>
+      </w:pPr>
+      <w:r>
+        <w:rPr>
+          <w:rFonts w:ascii="Georgia" w:hAnsi="Georgia"/>
+          <w:sz w:val="22"/>
+        </w:rPr>
+        <w:t>Das Siegel brach. Rotes Wachs auf seinen Fingern.</w:t>
+      </w:r>
+    </w:p>
+    <w:p>
+      <w:pPr>
+        <w:spacing w:before="80" w:after="0"/>
+      </w:pPr>
+      <w:r>
+        <w:rPr>
+          <w:rFonts w:ascii="Georgia" w:hAnsi="Georgia"/>
+          <w:sz w:val="22"/>
+        </w:rPr>
+        <w:t>Ben hielt die Luft an. Mila beugte sich vor.</w:t>
+      </w:r>
+    </w:p>
+    <w:p>
+      <w:pPr>
+        <w:spacing w:before="280" w:after="280"/>
+        <w:jc w:val="center"/>
+      </w:pPr>
+      <w:r>
+        <w:rPr>
+          <w:rFonts w:ascii="Georgia" w:hAnsi="Georgia"/>
+          <w:color w:val="787878"/>
+          <w:sz w:val="24"/>
+        </w:rPr>
+        <w:t>[ … ]</w:t>
       </w:r>
     </w:p>
     <w:p>
@@ -36528,7 +37547,7 @@
           <w:b/>
           <w:sz w:val="26"/>
         </w:rPr>
-        <w:t>Band 2: Das Geheimnis des Brunnens</w:t>
+        <w:t>Das Geheimnis des Brunnens</w:t>
       </w:r>
     </w:p>
     <w:p>

</xml_diff>

<commit_message>
Alle Baende: Impressum-Kredit-Zeilen raus + Titel-Ueberlappung behoben
Impressum: Lektorat/Korrektorat/Coverdesign/Satz-und-Layout entfernt.
- Band 1 hatte "[NAME]"-Platzhalter (kaputt), Band 2/3/4 "Benjamin Krug".
- Bleibt: Titel, (c), Alle Rechte, Independently published, ISBN, Fiktion.

Titelseite: Serientitel "Die Herrenhaus-Detektive" (22pt) brach auf dem
schmalen 5x8-Blatt (Band 1) in zwei Zeilen um, die wegen des EXAKTEN
Zeilenabstands (Pt(14)) des Normal-Stils uebereinander lagen.
- Band 1: line_spacing=1.0 (mitwachsend) auf Serientitel + Buchtitel + Teaser.
- Band 2/3/4: Serientitel Pt(32) / Buchtitel Pt(28) (deine manuelle Wahl);
  meine redundanten =1.0-Zeilen davor wieder entfernt.

Alle vier kompiliert; Band-1-Titel/Impressum und Band-2-Titel/Impressum via
LibreOffice gerendert und geprueft.

Co-Authored-By: Claude Opus 4.8 <noreply@anthropic.com>
</commit_message>
<xml_diff>
--- a/Band_1/Linear/Manuskript.docx
+++ b/Band_1/Linear/Manuskript.docx
@@ -24,7 +24,7 @@
     </w:p>
     <w:p>
       <w:pPr>
-        <w:spacing w:after="160"/>
+        <w:spacing w:line="240" w:lineRule="auto" w:after="160"/>
         <w:jc w:val="center"/>
       </w:pPr>
       <w:r>
@@ -51,7 +51,7 @@
     </w:p>
     <w:p>
       <w:pPr>
-        <w:spacing w:after="800"/>
+        <w:spacing w:line="240" w:lineRule="auto" w:after="800"/>
         <w:jc w:val="center"/>
       </w:pPr>
       <w:r>
@@ -159,64 +159,6 @@
           <w:sz w:val="16"/>
         </w:rPr>
         <w:t>Independently published</w:t>
-      </w:r>
-    </w:p>
-    <w:p>
-      <w:pPr>
-        <w:spacing w:after="40"/>
-        <w:jc w:val="left"/>
-      </w:pPr>
-    </w:p>
-    <w:p>
-      <w:pPr>
-        <w:spacing w:after="40"/>
-        <w:jc w:val="left"/>
-      </w:pPr>
-      <w:r>
-        <w:rPr>
-          <w:rFonts w:ascii="Georgia" w:hAnsi="Georgia"/>
-          <w:sz w:val="16"/>
-        </w:rPr>
-        <w:t>Lektorat: [NAME]</w:t>
-      </w:r>
-    </w:p>
-    <w:p>
-      <w:pPr>
-        <w:spacing w:after="40"/>
-        <w:jc w:val="left"/>
-      </w:pPr>
-      <w:r>
-        <w:rPr>
-          <w:rFonts w:ascii="Georgia" w:hAnsi="Georgia"/>
-          <w:sz w:val="16"/>
-        </w:rPr>
-        <w:t>Korrektorat: [NAME]</w:t>
-      </w:r>
-    </w:p>
-    <w:p>
-      <w:pPr>
-        <w:spacing w:after="40"/>
-        <w:jc w:val="left"/>
-      </w:pPr>
-      <w:r>
-        <w:rPr>
-          <w:rFonts w:ascii="Georgia" w:hAnsi="Georgia"/>
-          <w:sz w:val="16"/>
-        </w:rPr>
-        <w:t>Coverdesign: [NAME]</w:t>
-      </w:r>
-    </w:p>
-    <w:p>
-      <w:pPr>
-        <w:spacing w:after="40"/>
-        <w:jc w:val="left"/>
-      </w:pPr>
-      <w:r>
-        <w:rPr>
-          <w:rFonts w:ascii="Georgia" w:hAnsi="Georgia"/>
-          <w:sz w:val="16"/>
-        </w:rPr>
-        <w:t>Satz und Layout: [NAME]</w:t>
       </w:r>
     </w:p>
     <w:p>
@@ -665,14 +607,14 @@
       </w:r>
     </w:p>
     <w:p>
-      <w:bookmarkStart w:id="75146" w:name="kapitel_1"/>
+      <w:bookmarkStart w:id="53815" w:name="kapitel_1"/>
       <w:pPr>
         <w:pStyle w:val="Heading1"/>
       </w:pPr>
       <w:r>
         <w:t>Der Blick zum Hügel</w:t>
       </w:r>
-      <w:bookmarkEnd w:id="75146"/>
+      <w:bookmarkEnd w:id="53815"/>
     </w:p>
     <w:p>
       <w:pPr>
@@ -2388,14 +2330,14 @@
       </w:r>
     </w:p>
     <w:p>
-      <w:bookmarkStart w:id="76386" w:name="kapitel_2"/>
+      <w:bookmarkStart w:id="2448" w:name="kapitel_2"/>
       <w:pPr>
         <w:pStyle w:val="Heading1"/>
       </w:pPr>
       <w:r>
         <w:t>Das alte Gerücht</w:t>
       </w:r>
-      <w:bookmarkEnd w:id="76386"/>
+      <w:bookmarkEnd w:id="2448"/>
     </w:p>
     <w:p>
       <w:pPr>
@@ -4490,14 +4432,14 @@
       </w:r>
     </w:p>
     <w:p>
-      <w:bookmarkStart w:id="75506" w:name="kapitel_3"/>
+      <w:bookmarkStart w:id="30442" w:name="kapitel_3"/>
       <w:pPr>
         <w:pStyle w:val="Heading1"/>
       </w:pPr>
       <w:r>
         <w:t>Der erste Beweis</w:t>
       </w:r>
-      <w:bookmarkEnd w:id="75506"/>
+      <w:bookmarkEnd w:id="30442"/>
     </w:p>
     <w:p>
       <w:pPr>
@@ -6334,14 +6276,14 @@
       </w:r>
     </w:p>
     <w:p>
-      <w:bookmarkStart w:id="70901" w:name="kapitel_4"/>
+      <w:bookmarkStart w:id="19041" w:name="kapitel_4"/>
       <w:pPr>
         <w:pStyle w:val="Heading1"/>
       </w:pPr>
       <w:r>
         <w:t>Das verbotene Tor</w:t>
       </w:r>
-      <w:bookmarkEnd w:id="70901"/>
+      <w:bookmarkEnd w:id="19041"/>
     </w:p>
     <w:p>
       <w:pPr>
@@ -8214,14 +8156,14 @@
       </w:r>
     </w:p>
     <w:p>
-      <w:bookmarkStart w:id="6134" w:name="kapitel_5"/>
+      <w:bookmarkStart w:id="53622" w:name="kapitel_5"/>
       <w:pPr>
         <w:pStyle w:val="Heading1"/>
       </w:pPr>
       <w:r>
         <w:t>Die geheime Botschaft</w:t>
       </w:r>
-      <w:bookmarkEnd w:id="6134"/>
+      <w:bookmarkEnd w:id="53622"/>
     </w:p>
     <w:p>
       <w:pPr>
@@ -9851,14 +9793,14 @@
       </w:r>
     </w:p>
     <w:p>
-      <w:bookmarkStart w:id="9909" w:name="kapitel_6"/>
+      <w:bookmarkStart w:id="15483" w:name="kapitel_6"/>
       <w:pPr>
         <w:pStyle w:val="Heading1"/>
       </w:pPr>
       <w:r>
         <w:t>Das knarrende Treppenhaus</w:t>
       </w:r>
-      <w:bookmarkEnd w:id="9909"/>
+      <w:bookmarkEnd w:id="15483"/>
     </w:p>
     <w:p>
       <w:pPr>
@@ -11815,14 +11757,14 @@
       </w:r>
     </w:p>
     <w:p>
-      <w:bookmarkStart w:id="97817" w:name="kapitel_7"/>
+      <w:bookmarkStart w:id="16464" w:name="kapitel_7"/>
       <w:pPr>
         <w:pStyle w:val="Heading1"/>
       </w:pPr>
       <w:r>
         <w:t>Die falsche Spur</w:t>
       </w:r>
-      <w:bookmarkEnd w:id="97817"/>
+      <w:bookmarkEnd w:id="16464"/>
     </w:p>
     <w:p>
       <w:pPr>
@@ -13913,14 +13855,14 @@
       </w:r>
     </w:p>
     <w:p>
-      <w:bookmarkStart w:id="71463" w:name="kapitel_8"/>
+      <w:bookmarkStart w:id="29319" w:name="kapitel_8"/>
       <w:pPr>
         <w:pStyle w:val="Heading1"/>
       </w:pPr>
       <w:r>
         <w:t>Das Rätsel der Symbole</w:t>
       </w:r>
-      <w:bookmarkEnd w:id="71463"/>
+      <w:bookmarkEnd w:id="29319"/>
     </w:p>
     <w:p>
       <w:pPr>
@@ -15686,14 +15628,14 @@
       </w:r>
     </w:p>
     <w:p>
-      <w:bookmarkStart w:id="76646" w:name="kapitel_9"/>
+      <w:bookmarkStart w:id="42840" w:name="kapitel_9"/>
       <w:pPr>
         <w:pStyle w:val="Heading1"/>
       </w:pPr>
       <w:r>
         <w:t>Die nächtliche Begegnung</w:t>
       </w:r>
-      <w:bookmarkEnd w:id="76646"/>
+      <w:bookmarkEnd w:id="42840"/>
     </w:p>
     <w:p>
       <w:pPr>
@@ -17980,14 +17922,14 @@
       </w:r>
     </w:p>
     <w:p>
-      <w:bookmarkStart w:id="86109" w:name="kapitel_10"/>
+      <w:bookmarkStart w:id="35622" w:name="kapitel_10"/>
       <w:pPr>
         <w:pStyle w:val="Heading1"/>
       </w:pPr>
       <w:r>
         <w:t>Der Verdächtige</w:t>
       </w:r>
-      <w:bookmarkEnd w:id="86109"/>
+      <w:bookmarkEnd w:id="35622"/>
     </w:p>
     <w:p>
       <w:pPr>
@@ -19922,14 +19864,14 @@
       </w:r>
     </w:p>
     <w:p>
-      <w:bookmarkStart w:id="44232" w:name="kapitel_11"/>
+      <w:bookmarkStart w:id="92172" w:name="kapitel_11"/>
       <w:pPr>
         <w:pStyle w:val="Heading1"/>
       </w:pPr>
       <w:r>
         <w:t>Die geheime Karte</w:t>
       </w:r>
-      <w:bookmarkEnd w:id="44232"/>
+      <w:bookmarkEnd w:id="92172"/>
     </w:p>
     <w:p>
       <w:pPr>
@@ -22007,14 +21949,14 @@
       </w:r>
     </w:p>
     <w:p>
-      <w:bookmarkStart w:id="65490" w:name="kapitel_12"/>
+      <w:bookmarkStart w:id="39561" w:name="kapitel_12"/>
       <w:pPr>
         <w:pStyle w:val="Heading1"/>
       </w:pPr>
       <w:r>
         <w:t>Der verschlossene Keller</w:t>
       </w:r>
-      <w:bookmarkEnd w:id="65490"/>
+      <w:bookmarkEnd w:id="39561"/>
     </w:p>
     <w:p>
       <w:pPr>
@@ -24139,14 +24081,14 @@
       </w:r>
     </w:p>
     <w:p>
-      <w:bookmarkStart w:id="56131" w:name="kapitel_13"/>
+      <w:bookmarkStart w:id="40368" w:name="kapitel_13"/>
       <w:pPr>
         <w:pStyle w:val="Heading1"/>
       </w:pPr>
       <w:r>
         <w:t>Eingeschlossen</w:t>
       </w:r>
-      <w:bookmarkEnd w:id="56131"/>
+      <w:bookmarkEnd w:id="40368"/>
     </w:p>
     <w:p>
       <w:pPr>
@@ -26130,14 +26072,14 @@
       </w:r>
     </w:p>
     <w:p>
-      <w:bookmarkStart w:id="78603" w:name="kapitel_14"/>
+      <w:bookmarkStart w:id="50796" w:name="kapitel_14"/>
       <w:pPr>
         <w:pStyle w:val="Heading1"/>
       </w:pPr>
       <w:r>
         <w:t>Die Wahrheit über den Spuk</w:t>
       </w:r>
-      <w:bookmarkEnd w:id="78603"/>
+      <w:bookmarkEnd w:id="50796"/>
     </w:p>
     <w:p>
       <w:pPr>
@@ -28065,14 +28007,14 @@
       </w:r>
     </w:p>
     <w:p>
-      <w:bookmarkStart w:id="76023" w:name="kapitel_15"/>
+      <w:bookmarkStart w:id="11531" w:name="kapitel_15"/>
       <w:pPr>
         <w:pStyle w:val="Heading1"/>
       </w:pPr>
       <w:r>
         <w:t>Belauscht</w:t>
       </w:r>
-      <w:bookmarkEnd w:id="76023"/>
+      <w:bookmarkEnd w:id="11531"/>
     </w:p>
     <w:p>
       <w:pPr>
@@ -29683,14 +29625,14 @@
       </w:r>
     </w:p>
     <w:p>
-      <w:bookmarkStart w:id="1414" w:name="kapitel_16"/>
+      <w:bookmarkStart w:id="75282" w:name="kapitel_16"/>
       <w:pPr>
         <w:pStyle w:val="Heading1"/>
       </w:pPr>
       <w:r>
         <w:t>Die ganze Wahrheit</w:t>
       </w:r>
-      <w:bookmarkEnd w:id="1414"/>
+      <w:bookmarkEnd w:id="75282"/>
     </w:p>
     <w:p>
       <w:pPr>
@@ -31375,14 +31317,14 @@
       </w:r>
     </w:p>
     <w:p>
-      <w:bookmarkStart w:id="9383" w:name="kapitel_17"/>
+      <w:bookmarkStart w:id="39016" w:name="kapitel_17"/>
       <w:pPr>
         <w:pStyle w:val="Heading1"/>
       </w:pPr>
       <w:r>
         <w:t>Der letzte Wille</w:t>
       </w:r>
-      <w:bookmarkEnd w:id="9383"/>
+      <w:bookmarkEnd w:id="39016"/>
     </w:p>
     <w:p>
       <w:pPr>
@@ -32967,14 +32909,14 @@
       </w:r>
     </w:p>
     <w:p>
-      <w:bookmarkStart w:id="92433" w:name="kapitel_18"/>
+      <w:bookmarkStart w:id="21923" w:name="kapitel_18"/>
       <w:pPr>
         <w:pStyle w:val="Heading1"/>
       </w:pPr>
       <w:r>
         <w:t>Meiers Geschichte</w:t>
       </w:r>
-      <w:bookmarkEnd w:id="92433"/>
+      <w:bookmarkEnd w:id="21923"/>
     </w:p>
     <w:p>
       <w:pPr>
@@ -34843,14 +34785,14 @@
       </w:r>
     </w:p>
     <w:p>
-      <w:bookmarkStart w:id="62916" w:name="kapitel_19"/>
+      <w:bookmarkStart w:id="71975" w:name="kapitel_19"/>
       <w:pPr>
         <w:pStyle w:val="Heading1"/>
       </w:pPr>
       <w:r>
         <w:t>Ein neues Geheimnis</w:t>
       </w:r>
-      <w:bookmarkEnd w:id="62916"/>
+      <w:bookmarkEnd w:id="71975"/>
     </w:p>
     <w:p>
       <w:pPr>
@@ -36199,7 +36141,7 @@
     </w:p>
     <w:p>
       <w:pPr>
-        <w:spacing w:after="360"/>
+        <w:spacing w:line="240" w:lineRule="auto" w:after="360"/>
         <w:jc w:val="center"/>
       </w:pPr>
       <w:r>

</xml_diff>